<commit_message>
feat: enforce GraphQL authorization by user role
</commit_message>
<xml_diff>
--- a/docs/lab5-p1-p2.docx
+++ b/docs/lab5-p1-p2.docx
@@ -15563,154 +15563,540 @@
     </w:p>
     <w:p>
       <w:pPr>
-        <w:spacing w:after="0" w:line="240" w:lineRule="auto"/>
-        <w:ind w:firstLine="709"/>
         <w:jc w:val="both"/>
-        <w:rPr>
-          <w:rFonts w:ascii="Times New Roman" w:hAnsi="Times New Roman" w:cs="Times New Roman"/>
-          <w:sz w:val="28"/>
-          <w:szCs w:val="28"/>
-        </w:rPr>
-      </w:pPr>
-      <w:r>
-        <w:rPr>
-          <w:rFonts w:ascii="Times New Roman" w:hAnsi="Times New Roman" w:cs="Times New Roman"/>
-          <w:sz w:val="28"/>
-          <w:szCs w:val="28"/>
-        </w:rPr>
-        <w:t>•</w:t>
-      </w:r>
-      <w:r>
-        <w:rPr>
-          <w:rFonts w:ascii="Times New Roman" w:hAnsi="Times New Roman" w:cs="Times New Roman"/>
-          <w:sz w:val="28"/>
-          <w:szCs w:val="28"/>
-        </w:rPr>
-        <w:tab/>
-        <w:t>реализовать роли пользователей;</w:t>
-      </w:r>
-    </w:p>
-    <w:p>
-      <w:pPr>
-        <w:spacing w:after="0" w:line="240" w:lineRule="auto"/>
-        <w:ind w:firstLine="709"/>
+      </w:pPr>
+      <w:r>
+        <w:rPr>
+          <w:b/>
+        </w:rPr>
+        <w:t xml:space="preserve">3.1. Реализовать роли пользователей</w:t>
+      </w:r>
+    </w:p>
+    <w:p>
+      <w:pPr>
         <w:jc w:val="both"/>
-        <w:rPr>
-          <w:rFonts w:ascii="Times New Roman" w:hAnsi="Times New Roman" w:cs="Times New Roman"/>
-          <w:sz w:val="28"/>
-          <w:szCs w:val="28"/>
-        </w:rPr>
-      </w:pPr>
-      <w:r>
-        <w:rPr>
-          <w:rFonts w:ascii="Times New Roman" w:hAnsi="Times New Roman" w:cs="Times New Roman"/>
-          <w:sz w:val="28"/>
-          <w:szCs w:val="28"/>
-        </w:rPr>
-        <w:t>•</w:t>
-      </w:r>
-      <w:r>
-        <w:rPr>
-          <w:rFonts w:ascii="Times New Roman" w:hAnsi="Times New Roman" w:cs="Times New Roman"/>
-          <w:sz w:val="28"/>
-          <w:szCs w:val="28"/>
-        </w:rPr>
-        <w:tab/>
-        <w:t>реализовать разграничение доступа к операциям системы;</w:t>
-      </w:r>
-    </w:p>
-    <w:p>
-      <w:pPr>
-        <w:spacing w:after="0" w:line="240" w:lineRule="auto"/>
-        <w:ind w:firstLine="709"/>
+      </w:pPr>
+      <w:r>
+        <w:rPr/>
+        <w:t xml:space="preserve">В Auth Service роли client, trainer и admin хранятся в справочнике auth_role. Учётная запись содержит ссылку на роль. После аутентификации роль включается в JWT и в активную Redis-сессию, а API Gateway получает её через SessionUserDto. Публичная регистрация допускает только client и trainer; роль admin назначается административной операцией.</w:t>
+      </w:r>
+    </w:p>
+    <w:p>
+      <w:pPr>
         <w:jc w:val="both"/>
-        <w:rPr>
-          <w:rFonts w:ascii="Times New Roman" w:hAnsi="Times New Roman" w:cs="Times New Roman"/>
-          <w:sz w:val="28"/>
-          <w:szCs w:val="28"/>
-        </w:rPr>
-      </w:pPr>
-      <w:r>
-        <w:rPr>
-          <w:rFonts w:ascii="Times New Roman" w:hAnsi="Times New Roman" w:cs="Times New Roman"/>
-          <w:sz w:val="28"/>
-          <w:szCs w:val="28"/>
-        </w:rPr>
-        <w:t>•</w:t>
-      </w:r>
-      <w:r>
-        <w:rPr>
-          <w:rFonts w:ascii="Times New Roman" w:hAnsi="Times New Roman" w:cs="Times New Roman"/>
-          <w:sz w:val="28"/>
-          <w:szCs w:val="28"/>
-        </w:rPr>
-        <w:tab/>
-        <w:t xml:space="preserve">ограничить доступ к </w:t>
-      </w:r>
-      <w:proofErr w:type="spellStart"/>
-      <w:r>
-        <w:rPr>
-          <w:rFonts w:ascii="Times New Roman" w:hAnsi="Times New Roman" w:cs="Times New Roman"/>
-          <w:sz w:val="28"/>
-          <w:szCs w:val="28"/>
-        </w:rPr>
-        <w:t>Query</w:t>
-      </w:r>
-      <w:proofErr w:type="spellEnd"/>
-      <w:r>
-        <w:rPr>
-          <w:rFonts w:ascii="Times New Roman" w:hAnsi="Times New Roman" w:cs="Times New Roman"/>
-          <w:sz w:val="28"/>
-          <w:szCs w:val="28"/>
-        </w:rPr>
-        <w:t xml:space="preserve"> и </w:t>
-      </w:r>
-      <w:proofErr w:type="spellStart"/>
-      <w:r>
-        <w:rPr>
-          <w:rFonts w:ascii="Times New Roman" w:hAnsi="Times New Roman" w:cs="Times New Roman"/>
-          <w:sz w:val="28"/>
-          <w:szCs w:val="28"/>
-        </w:rPr>
-        <w:t>Mutation</w:t>
-      </w:r>
-      <w:proofErr w:type="spellEnd"/>
-      <w:r>
-        <w:rPr>
-          <w:rFonts w:ascii="Times New Roman" w:hAnsi="Times New Roman" w:cs="Times New Roman"/>
-          <w:sz w:val="28"/>
-          <w:szCs w:val="28"/>
-        </w:rPr>
-        <w:t xml:space="preserve"> в зависимости от роли пользователя;</w:t>
-      </w:r>
-    </w:p>
-    <w:p>
-      <w:pPr>
-        <w:spacing w:after="0" w:line="240" w:lineRule="auto"/>
-        <w:ind w:firstLine="709"/>
+      </w:pPr>
+      <w:r>
+        <w:rPr>
+          <w:b/>
+        </w:rPr>
+        <w:t xml:space="preserve">Листинг 16 – набор ролей в базе данных</w:t>
+      </w:r>
+    </w:p>
+    <w:p>
+      <w:pPr>
         <w:jc w:val="both"/>
-        <w:rPr>
-          <w:rFonts w:ascii="Times New Roman" w:hAnsi="Times New Roman" w:cs="Times New Roman"/>
-          <w:sz w:val="28"/>
-          <w:szCs w:val="28"/>
-        </w:rPr>
-      </w:pPr>
-      <w:r>
-        <w:rPr>
-          <w:rFonts w:ascii="Times New Roman" w:hAnsi="Times New Roman" w:cs="Times New Roman"/>
-          <w:sz w:val="28"/>
-          <w:szCs w:val="28"/>
-        </w:rPr>
-        <w:t>•</w:t>
-      </w:r>
-      <w:r>
-        <w:rPr>
-          <w:rFonts w:ascii="Times New Roman" w:hAnsi="Times New Roman" w:cs="Times New Roman"/>
-          <w:sz w:val="28"/>
-          <w:szCs w:val="28"/>
-        </w:rPr>
-        <w:tab/>
-        <w:t>реализовать проверку прав доступа.</w:t>
+        <w:shd w:fill="F2F2F2"/>
+      </w:pPr>
+      <w:r>
+        <w:rPr>
+          <w:rFonts w:ascii="Courier New" w:hAnsi="Courier New" w:eastAsia="Courier New"/>
+          <w:sz w:val="18"/>
+        </w:rPr>
+        <w:t xml:space="preserve">INSERT INTO auth_role (name) VALUES ('client'), ('trainer'), ('admin');</w:t>
+      </w:r>
+    </w:p>
+    <w:p>
+      <w:pPr>
+        <w:jc w:val="both"/>
+      </w:pPr>
+      <w:r>
+        <w:rPr>
+          <w:b/>
+        </w:rPr>
+        <w:t xml:space="preserve">Листинг 17 – роль проверенной сессии</w:t>
+      </w:r>
+    </w:p>
+    <w:p>
+      <w:pPr>
+        <w:jc w:val="both"/>
+        <w:shd w:fill="F2F2F2"/>
+      </w:pPr>
+      <w:r>
+        <w:rPr>
+          <w:rFonts w:ascii="Courier New" w:hAnsi="Courier New" w:eastAsia="Courier New"/>
+          <w:sz w:val="18"/>
+        </w:rPr>
+        <w:t xml:space="preserve">public record SessionUserDto(Long userId, String email, String role) {</w:t>
+        <w:br/>
+        <w:t xml:space="preserve">}</w:t>
+      </w:r>
+    </w:p>
+    <w:p>
+      <w:pPr>
+        <w:jc w:val="both"/>
+      </w:pPr>
+      <w:r>
+        <w:rPr/>
+        <w:t xml:space="preserve">Роль берётся только из проверенной активной сессии. Поэтому клиент не может изменить её, передав произвольное значение в GraphQL-запросе.</w:t>
+      </w:r>
+    </w:p>
+    <w:p>
+      <w:pPr>
+        <w:jc w:val="both"/>
+      </w:pPr>
+      <w:r>
+        <w:rPr>
+          <w:b/>
+        </w:rPr>
+        <w:t xml:space="preserve">3.2. Реализовать разграничение доступа к операциям системы</w:t>
+      </w:r>
+    </w:p>
+    <w:p>
+      <w:pPr>
+        <w:jc w:val="both"/>
+      </w:pPr>
+      <w:r>
+        <w:rPr/>
+        <w:t xml:space="preserve">В API Gateway добавлен единый компонент GraphQlAuthorizationPolicy. Он содержит правила доступа к корневым операциям GraphQL. В правилах перечислены роли, которым разрешена конкретная операция. Если операция не указана в правилах, она запрещается по умолчанию.</w:t>
+      </w:r>
+    </w:p>
+    <w:p>
+      <w:pPr>
+        <w:jc w:val="both"/>
+      </w:pPr>
+      <w:r>
+        <w:rPr/>
+        <w:t xml:space="preserve">Клиенту доступны личные данные, запись и отмена записи на занятие, абонементы, платежи и собственный прогресс. Тренеру доступны программы тренировок, расписание и фиксация прогресса клиентов. Администратору доступны управление пользователями, все записи и аналитика. Общие операции просмотра программ и занятий доступны всем аутентифицированным ролям.</w:t>
+      </w:r>
+    </w:p>
+    <w:p>
+      <w:pPr>
+        <w:jc w:val="both"/>
+      </w:pPr>
+      <w:r>
+        <w:rPr>
+          <w:b/>
+        </w:rPr>
+        <w:t xml:space="preserve">Листинг 18 – фрагмент правил разграничения доступа</w:t>
+      </w:r>
+    </w:p>
+    <w:p>
+      <w:pPr>
+        <w:jc w:val="both"/>
+        <w:shd w:fill="F2F2F2"/>
+      </w:pPr>
+      <w:r>
+        <w:rPr>
+          <w:rFonts w:ascii="Courier New" w:hAnsi="Courier New" w:eastAsia="Courier New"/>
+          <w:sz w:val="18"/>
+        </w:rPr>
+        <w:t xml:space="preserve">private static final Map&lt;String, Set&lt;String&gt;&gt; OPERATION_ROLES = Map.ofEntries(</w:t>
+        <w:br/>
+        <w:t xml:space="preserve">        Map.entry("myBookings", Set.of("client")),</w:t>
+        <w:br/>
+        <w:t xml:space="preserve">        Map.entry("bookWorkout", Set.of("client")),</w:t>
+        <w:br/>
+        <w:t xml:space="preserve">        Map.entry("createTrainingProgram", Set.of("trainer", "admin")),</w:t>
+        <w:br/>
+        <w:t xml:space="preserve">        Map.entry("createWorkout", Set.of("trainer", "admin")),</w:t>
+        <w:br/>
+        <w:t xml:space="preserve">        Map.entry("logProgress", Set.of("trainer", "admin")),</w:t>
+        <w:br/>
+        <w:t xml:space="preserve">        Map.entry("users", Set.of("admin")),</w:t>
+        <w:br/>
+        <w:t xml:space="preserve">        Map.entry("attendanceStats", Set.of("admin")),</w:t>
+        <w:br/>
+        <w:t xml:space="preserve">        Map.entry("updateUserRole", Set.of("admin"))</w:t>
+        <w:br/>
+        <w:t xml:space="preserve">);</w:t>
+      </w:r>
+    </w:p>
+    <w:p>
+      <w:pPr>
+        <w:jc w:val="both"/>
+      </w:pPr>
+      <w:r>
+        <w:rPr>
+          <w:b/>
+        </w:rPr>
+        <w:t xml:space="preserve">3.3. Ограничить доступ к Query и Mutation в зависимости от роли пользователя</w:t>
+      </w:r>
+    </w:p>
+    <w:p>
+      <w:pPr>
+        <w:jc w:val="both"/>
+      </w:pPr>
+      <w:r>
+        <w:rPr/>
+        <w:t xml:space="preserve">Проверяются как Query, так и Mutation. При разборе GraphQL-документа шлюз получает каждую корневую операцию и сопоставляет её имя с правилами. Это исключает ситуацию, когда пользователь с ролью client выполняет Mutation тренера или Query администратора.</w:t>
+      </w:r>
+    </w:p>
+    <w:p>
+      <w:pPr>
+        <w:jc w:val="both"/>
+      </w:pPr>
+      <w:r>
+        <w:rPr>
+          <w:b/>
+        </w:rPr>
+        <w:t xml:space="preserve">Листинг 19 – проверка набора операций для роли</w:t>
+      </w:r>
+    </w:p>
+    <w:p>
+      <w:pPr>
+        <w:jc w:val="both"/>
+        <w:shd w:fill="F2F2F2"/>
+      </w:pPr>
+      <w:r>
+        <w:rPr>
+          <w:rFonts w:ascii="Courier New" w:hAnsi="Courier New" w:eastAsia="Courier New"/>
+          <w:sz w:val="18"/>
+        </w:rPr>
+        <w:t xml:space="preserve">public void authorize(String source, SessionUserDto user) {</w:t>
+        <w:br/>
+        <w:t xml:space="preserve">    OperationDefinition operation = singleOperation(source);</w:t>
+        <w:br/>
+        <w:t xml:space="preserve">    String role = user.role().toLowerCase(Locale.ROOT);</w:t>
+        <w:br/>
+        <w:t xml:space="preserve"/>
+        <w:br/>
+        <w:t xml:space="preserve">    for (Selection&lt;?&gt; selection : operation.getSelectionSet().getSelections()) {</w:t>
+        <w:br/>
+        <w:t xml:space="preserve">        if (!(selection instanceof Field field)) {</w:t>
+        <w:br/>
+        <w:t xml:space="preserve">            throw new GraphQlAccessDeniedException(</w:t>
+        <w:br/>
+        <w:t xml:space="preserve">                    "GraphQL fragments are not supported in protected operations");</w:t>
+        <w:br/>
+        <w:t xml:space="preserve">        }</w:t>
+        <w:br/>
+        <w:t xml:space="preserve">        Set&lt;String&gt; permittedRoles = OPERATION_ROLES.get(field.getName());</w:t>
+        <w:br/>
+        <w:t xml:space="preserve">        if (permittedRoles == null || !permittedRoles.contains(role)) {</w:t>
+        <w:br/>
+        <w:t xml:space="preserve">            throw new GraphQlAccessDeniedException(</w:t>
+        <w:br/>
+        <w:t xml:space="preserve">                    "Role '" + role + "' is not allowed to execute operation '"</w:t>
+        <w:br/>
+        <w:t xml:space="preserve">                            + field.getName() + "'");</w:t>
+        <w:br/>
+        <w:t xml:space="preserve">        }</w:t>
+        <w:br/>
+        <w:t xml:space="preserve">    }</w:t>
+        <w:br/>
+        <w:t xml:space="preserve">}</w:t>
+      </w:r>
+    </w:p>
+    <w:p>
+      <w:pPr>
+        <w:jc w:val="both"/>
+      </w:pPr>
+      <w:r>
+        <w:rPr/>
+        <w:t xml:space="preserve">Операции register и login остаются открытыми, поскольку пользователь ещё не имеет сессии. Для любой другой операции требуется действительный JWT, активная Redis-сессия и разрешение по роли.</w:t>
+      </w:r>
+    </w:p>
+    <w:p>
+      <w:pPr>
+        <w:jc w:val="both"/>
+      </w:pPr>
+      <w:r>
+        <w:rPr>
+          <w:b/>
+        </w:rPr>
+        <w:t xml:space="preserve">3.4. Реализовать проверку прав доступа</w:t>
+      </w:r>
+    </w:p>
+    <w:p>
+      <w:pPr>
+        <w:jc w:val="both"/>
+      </w:pPr>
+      <w:r>
+        <w:rPr/>
+        <w:t xml:space="preserve">Проверка прав выполняется после проверки JWT и Redis-сессии, но до вызова GraphQL-resolver. Если роль не имеет права на операцию, шлюз прекращает выполнение и возвращает HTTP 403 Forbidden. В контекст выполнения помещается только уже проверенный пользователь.</w:t>
+      </w:r>
+    </w:p>
+    <w:p>
+      <w:pPr>
+        <w:jc w:val="both"/>
+      </w:pPr>
+      <w:r>
+        <w:rPr>
+          <w:b/>
+        </w:rPr>
+        <w:t xml:space="preserve">Листинг 20 – применение проверки прав в GraphQL-перехватчике</w:t>
+      </w:r>
+    </w:p>
+    <w:p>
+      <w:pPr>
+        <w:jc w:val="both"/>
+        <w:shd w:fill="F2F2F2"/>
+      </w:pPr>
+      <w:r>
+        <w:rPr>
+          <w:rFonts w:ascii="Courier New" w:hAnsi="Courier New" w:eastAsia="Courier New"/>
+          <w:sz w:val="18"/>
+        </w:rPr>
+        <w:t xml:space="preserve">try {</w:t>
+        <w:br/>
+        <w:t xml:space="preserve">    authorizationPolicy.authorize(request.getDocument(), authenticatedUser);</w:t>
+        <w:br/>
+        <w:t xml:space="preserve">} catch (GraphQlAccessDeniedException exception) {</w:t>
+        <w:br/>
+        <w:t xml:space="preserve">    return Mono.error(new ResponseStatusException(</w:t>
+        <w:br/>
+        <w:t xml:space="preserve">            HttpStatus.FORBIDDEN, exception.getMessage()));</w:t>
+        <w:br/>
+        <w:t xml:space="preserve">}</w:t>
+        <w:br/>
+        <w:t xml:space="preserve">request.configureExecutionInput((executionInput, builder) -&gt; builder</w:t>
+        <w:br/>
+        <w:t xml:space="preserve">        .graphQLContext(context -&gt; context.put(</w:t>
+        <w:br/>
+        <w:t xml:space="preserve">                AUTHENTICATED_USER_CONTEXT_KEY, authenticatedUser))</w:t>
+        <w:br/>
+        <w:t xml:space="preserve">        .build());</w:t>
+      </w:r>
+    </w:p>
+    <w:p>
+      <w:pPr>
+        <w:jc w:val="both"/>
+      </w:pPr>
+      <w:r>
+        <w:rPr/>
+        <w:t xml:space="preserve">В результате проверка сессии отвечает на вопрос «кто выполняет запрос», а проверка прав — «разрешена ли этому пользователю конкретная операция». Оба условия обязательны.</w:t>
+      </w:r>
+    </w:p>
+    <w:p>
+      <w:pPr>
+        <w:jc w:val="both"/>
+      </w:pPr>
+      <w:r>
+        <w:rPr>
+          <w:b/>
+        </w:rPr>
+        <w:t xml:space="preserve">3.5. Тестирование авторизации запросами GraphQL</w:t>
+      </w:r>
+    </w:p>
+    <w:p>
+      <w:pPr>
+        <w:jc w:val="both"/>
+      </w:pPr>
+      <w:r>
+        <w:rPr/>
+        <w:t xml:space="preserve">Для всех следующих запросов в Altair указывается заголовок Authorization: Bearer &lt;токен&gt;. Токен клиента, тренера и администратора получают отдельными mutation login. Ниже приведены только текстовые запросы.</w:t>
+      </w:r>
+    </w:p>
+    <w:p>
+      <w:pPr>
+        <w:jc w:val="both"/>
+      </w:pPr>
+      <w:r>
+        <w:rPr>
+          <w:b/>
+        </w:rPr>
+        <w:t xml:space="preserve">Листинг 21 – разрешённая операция клиента</w:t>
+      </w:r>
+    </w:p>
+    <w:p>
+      <w:pPr>
+        <w:jc w:val="both"/>
+        <w:shd w:fill="F2F2F2"/>
+      </w:pPr>
+      <w:r>
+        <w:rPr>
+          <w:rFonts w:ascii="Courier New" w:hAnsi="Courier New" w:eastAsia="Courier New"/>
+          <w:sz w:val="18"/>
+        </w:rPr>
+        <w:t xml:space="preserve">mutation {</w:t>
+        <w:br/>
+        <w:t xml:space="preserve">  bookWorkout(workoutId: 1) {</w:t>
+        <w:br/>
+        <w:t xml:space="preserve">    idBooking</w:t>
+        <w:br/>
+        <w:t xml:space="preserve">    status</w:t>
+        <w:br/>
+        <w:t xml:space="preserve">  }</w:t>
+        <w:br/>
+        <w:t xml:space="preserve">}</w:t>
+      </w:r>
+    </w:p>
+    <w:p>
+      <w:pPr>
+        <w:jc w:val="both"/>
+      </w:pPr>
+      <w:r>
+        <w:rPr/>
+        <w:t xml:space="preserve">С токеном клиента запрос разрешён.</w:t>
+      </w:r>
+    </w:p>
+    <w:p>
+      <w:pPr>
+        <w:jc w:val="both"/>
+      </w:pPr>
+      <w:r>
+        <w:rPr>
+          <w:b/>
+        </w:rPr>
+        <w:t xml:space="preserve">Листинг 22 – запрещённая для клиента операция тренера</w:t>
+      </w:r>
+    </w:p>
+    <w:p>
+      <w:pPr>
+        <w:jc w:val="both"/>
+        <w:shd w:fill="F2F2F2"/>
+      </w:pPr>
+      <w:r>
+        <w:rPr>
+          <w:rFonts w:ascii="Courier New" w:hAnsi="Courier New" w:eastAsia="Courier New"/>
+          <w:sz w:val="18"/>
+        </w:rPr>
+        <w:t xml:space="preserve">mutation {</w:t>
+        <w:br/>
+        <w:t xml:space="preserve">  createWorkout(input: {</w:t>
+        <w:br/>
+        <w:t xml:space="preserve">    idTrainingProgram: 1</w:t>
+        <w:br/>
+        <w:t xml:space="preserve">    startDatetime: "2026-10-23T10:00"</w:t>
+        <w:br/>
+        <w:t xml:space="preserve">    duration: 60</w:t>
+        <w:br/>
+        <w:t xml:space="preserve">    maxCapacity: 10</w:t>
+        <w:br/>
+        <w:t xml:space="preserve">  }) {</w:t>
+        <w:br/>
+        <w:t xml:space="preserve">    idWorkout</w:t>
+        <w:br/>
+        <w:t xml:space="preserve">  }</w:t>
+        <w:br/>
+        <w:t xml:space="preserve">}</w:t>
+      </w:r>
+    </w:p>
+    <w:p>
+      <w:pPr>
+        <w:jc w:val="both"/>
+      </w:pPr>
+      <w:r>
+        <w:rPr/>
+        <w:t xml:space="preserve">С токеном клиента запрос возвращает HTTP 403 Forbidden.</w:t>
+      </w:r>
+    </w:p>
+    <w:p>
+      <w:pPr>
+        <w:jc w:val="both"/>
+      </w:pPr>
+      <w:r>
+        <w:rPr>
+          <w:b/>
+        </w:rPr>
+        <w:t xml:space="preserve">Листинг 23 – разрешённая операция тренера</w:t>
+      </w:r>
+    </w:p>
+    <w:p>
+      <w:pPr>
+        <w:jc w:val="both"/>
+        <w:shd w:fill="F2F2F2"/>
+      </w:pPr>
+      <w:r>
+        <w:rPr>
+          <w:rFonts w:ascii="Courier New" w:hAnsi="Courier New" w:eastAsia="Courier New"/>
+          <w:sz w:val="18"/>
+        </w:rPr>
+        <w:t xml:space="preserve">mutation {</w:t>
+        <w:br/>
+        <w:t xml:space="preserve">  createWorkout(input: {</w:t>
+        <w:br/>
+        <w:t xml:space="preserve">    idTrainingProgram: 1</w:t>
+        <w:br/>
+        <w:t xml:space="preserve">    startDatetime: "2026-10-23T10:00"</w:t>
+        <w:br/>
+        <w:t xml:space="preserve">    duration: 60</w:t>
+        <w:br/>
+        <w:t xml:space="preserve">    maxCapacity: 10</w:t>
+        <w:br/>
+        <w:t xml:space="preserve">  }) {</w:t>
+        <w:br/>
+        <w:t xml:space="preserve">    idWorkout</w:t>
+        <w:br/>
+        <w:t xml:space="preserve">    status</w:t>
+        <w:br/>
+        <w:t xml:space="preserve">  }</w:t>
+        <w:br/>
+        <w:t xml:space="preserve">}</w:t>
+      </w:r>
+    </w:p>
+    <w:p>
+      <w:pPr>
+        <w:jc w:val="both"/>
+      </w:pPr>
+      <w:r>
+        <w:rPr/>
+        <w:t xml:space="preserve">С токеном тренера запрос разрешён.</w:t>
+      </w:r>
+    </w:p>
+    <w:p>
+      <w:pPr>
+        <w:jc w:val="both"/>
+      </w:pPr>
+      <w:r>
+        <w:rPr>
+          <w:b/>
+        </w:rPr>
+        <w:t xml:space="preserve">Листинг 24 – Query администратора</w:t>
+      </w:r>
+    </w:p>
+    <w:p>
+      <w:pPr>
+        <w:jc w:val="both"/>
+        <w:shd w:fill="F2F2F2"/>
+      </w:pPr>
+      <w:r>
+        <w:rPr>
+          <w:rFonts w:ascii="Courier New" w:hAnsi="Courier New" w:eastAsia="Courier New"/>
+          <w:sz w:val="18"/>
+        </w:rPr>
+        <w:t xml:space="preserve">query {</w:t>
+        <w:br/>
+        <w:t xml:space="preserve">  users {</w:t>
+        <w:br/>
+        <w:t xml:space="preserve">    idUser</w:t>
+        <w:br/>
+        <w:t xml:space="preserve">    name</w:t>
+        <w:br/>
+        <w:t xml:space="preserve">    email</w:t>
+        <w:br/>
+        <w:t xml:space="preserve">  }</w:t>
+        <w:br/>
+        <w:t xml:space="preserve">}</w:t>
+      </w:r>
+    </w:p>
+    <w:p>
+      <w:pPr>
+        <w:jc w:val="both"/>
+      </w:pPr>
+      <w:r>
+        <w:rPr/>
+        <w:t xml:space="preserve">С токеном тренера этот запрос возвращает HTTP 403, а с токеном администратора выполняется успешно. Тем самым проверены ограничения для Query и Mutation, а также проверка прав доступа.</w:t>
+      </w:r>
+    </w:p>
+    <w:p>
+      <w:pPr>
+        <w:jc w:val="both"/>
+      </w:pPr>
+      <w:r>
+        <w:rPr>
+          <w:b/>
+        </w:rPr>
+        <w:t xml:space="preserve">Вывод по пункту 3</w:t>
+      </w:r>
+    </w:p>
+    <w:p>
+      <w:pPr>
+        <w:jc w:val="both"/>
+      </w:pPr>
+      <w:r>
+        <w:rPr/>
+        <w:t xml:space="preserve">Реализована ролевая авторизация с ролями client, trainer и admin. API Gateway проверяет права для каждой корневой GraphQL-операции до передачи запроса в обработчик. Ограничения работают для Query и Mutation; нарушение правила приводит к HTTP 403. Проверка основана на роли из действительной JWT/Redis-сессии.</w:t>
       </w:r>
     </w:p>
     <w:p>

</xml_diff>

<commit_message>
docs: focus Redis session tests on point two
</commit_message>
<xml_diff>
--- a/docs/lab5-p1-p2.docx
+++ b/docs/lab5-p1-p2.docx
@@ -15346,7 +15346,7 @@
         <w:rPr>
           <w:b/>
         </w:rPr>
-        <w:t xml:space="preserve">Листинг 12 – регистрация пользователя</w:t>
+        <w:t xml:space="preserve">Листинг 12 – вход для получения токена и создания сессии</w:t>
       </w:r>
     </w:p>
     <w:p>
@@ -15361,16 +15361,12 @@
         </w:rPr>
         <w:t xml:space="preserve">mutation {</w:t>
         <w:br/>
-        <w:t xml:space="preserve">  register(input: {</w:t>
-        <w:br/>
-        <w:t xml:space="preserve">    name: "Redis Test"</w:t>
+        <w:t xml:space="preserve">  login(input: {</w:t>
         <w:br/>
         <w:t xml:space="preserve">    email: "redis.test@fit.by"</w:t>
         <w:br/>
         <w:t xml:space="preserve">    password: "securePass123"</w:t>
         <w:br/>
-        <w:t xml:space="preserve">    role: "CLIENT"</w:t>
-        <w:br/>
         <w:t xml:space="preserve">  }) {</w:t>
         <w:br/>
         <w:t xml:space="preserve">    token</w:t>
@@ -15387,10 +15383,19 @@
         <w:jc w:val="both"/>
       </w:pPr>
       <w:r>
+        <w:rPr/>
+        <w:t xml:space="preserve">Это подготовительный запрос: он получает JWT и создаёт Redis-сессию. Регистрация пользователя уже была протестирована в пункте 1 и здесь не повторяется.</w:t>
+      </w:r>
+    </w:p>
+    <w:p>
+      <w:pPr>
+        <w:jc w:val="both"/>
+      </w:pPr>
+      <w:r>
         <w:rPr>
           <w:b/>
         </w:rPr>
-        <w:t xml:space="preserve">Листинг 13 – вход пользователя</w:t>
+        <w:t xml:space="preserve">Листинг 13 – защищённый запрос с активной сессией</w:t>
       </w:r>
     </w:p>
     <w:p>
@@ -15403,19 +15408,17 @@
           <w:rFonts w:ascii="Courier New" w:hAnsi="Courier New" w:eastAsia="Courier New"/>
           <w:sz w:val="18"/>
         </w:rPr>
-        <w:t xml:space="preserve">mutation {</w:t>
-        <w:br/>
-        <w:t xml:space="preserve">  login(input: {</w:t>
-        <w:br/>
-        <w:t xml:space="preserve">    email: "redis.test@fit.by"</w:t>
-        <w:br/>
-        <w:t xml:space="preserve">    password: "securePass123"</w:t>
-        <w:br/>
-        <w:t xml:space="preserve">  }) {</w:t>
-        <w:br/>
-        <w:t xml:space="preserve">    token</w:t>
-        <w:br/>
-        <w:t xml:space="preserve">    user { idUser name email role { name } }</w:t>
+        <w:t xml:space="preserve">query {</w:t>
+        <w:br/>
+        <w:t xml:space="preserve">  trainingPrograms {</w:t>
+        <w:br/>
+        <w:t xml:space="preserve">    idTrainingProgram</w:t>
+        <w:br/>
+        <w:t xml:space="preserve">    name</w:t>
+        <w:br/>
+        <w:t xml:space="preserve">    type</w:t>
+        <w:br/>
+        <w:t xml:space="preserve">    difficultyLevel</w:t>
         <w:br/>
         <w:t xml:space="preserve">  }</w:t>
         <w:br/>
@@ -15427,10 +15430,19 @@
         <w:jc w:val="both"/>
       </w:pPr>
       <w:r>
+        <w:rPr/>
+        <w:t xml:space="preserve">С заголовком Authorization: Bearer &lt;токен_из_login&gt; запрос выполняется. Эта операция доступна любой аутентифицированной роли и подходит для проверки сессии независимо от правил пункта 3.</w:t>
+      </w:r>
+    </w:p>
+    <w:p>
+      <w:pPr>
+        <w:jc w:val="both"/>
+      </w:pPr>
+      <w:r>
         <w:rPr>
           <w:b/>
         </w:rPr>
-        <w:t xml:space="preserve">Листинг 14 – защищённый запрос с активной сессией</w:t>
+        <w:t xml:space="preserve">Листинг 14 – проверка времени жизни Redis-сессии</w:t>
       </w:r>
     </w:p>
     <w:p>
@@ -15443,19 +15455,7 @@
           <w:rFonts w:ascii="Courier New" w:hAnsi="Courier New" w:eastAsia="Courier New"/>
           <w:sz w:val="18"/>
         </w:rPr>
-        <w:t xml:space="preserve">query {</w:t>
-        <w:br/>
-        <w:t xml:space="preserve">  users {</w:t>
-        <w:br/>
-        <w:t xml:space="preserve">    idUser</w:t>
-        <w:br/>
-        <w:t xml:space="preserve">    name</w:t>
-        <w:br/>
-        <w:t xml:space="preserve">    email</w:t>
-        <w:br/>
-        <w:t xml:space="preserve">  }</w:t>
-        <w:br/>
-        <w:t xml:space="preserve">}</w:t>
+        <w:t xml:space="preserve">docker exec fitness-redis redis-cli TTL auth:session:&lt;jti&gt;</w:t>
       </w:r>
     </w:p>
     <w:p>
@@ -15464,7 +15464,7 @@
       </w:pPr>
       <w:r>
         <w:rPr/>
-        <w:t xml:space="preserve">При наличии действующего JWT и ключа auth:session:{jti} запрос выполняется. Без заголовка Authorization запрос получает HTTP 401.</w:t>
+        <w:t xml:space="preserve">Команда возвращает положительное число секунд, близкое к 3600 после входа. Это подтверждает, что сессия создаётся с ограниченным временем жизни. Ожидать один час для ручной проверки не требуется.</w:t>
       </w:r>
     </w:p>
     <w:p>
@@ -15475,7 +15475,16 @@
         <w:rPr>
           <w:b/>
         </w:rPr>
-        <w:t xml:space="preserve">Листинг 15 – проверка после удаления Redis-сессии</w:t>
+        <w:t xml:space="preserve">Листинг 15 – проверка отсутствующей сессии и повторного входа</w:t>
+      </w:r>
+    </w:p>
+    <w:p>
+      <w:pPr>
+        <w:jc w:val="both"/>
+      </w:pPr>
+      <w:r>
+        <w:rPr/>
+        <w:t xml:space="preserve">Сначала удалить тестовый ключ Redis командой: docker exec fitness-redis redis-cli DEL auth:session:&lt;jti&gt;. Затем с тем же заголовком Authorization повторить защищённый запрос.</w:t>
       </w:r>
     </w:p>
     <w:p>
@@ -15490,13 +15499,15 @@
         </w:rPr>
         <w:t xml:space="preserve">query {</w:t>
         <w:br/>
-        <w:t xml:space="preserve">  users {</w:t>
-        <w:br/>
-        <w:t xml:space="preserve">    idUser</w:t>
+        <w:t xml:space="preserve">  trainingPrograms {</w:t>
+        <w:br/>
+        <w:t xml:space="preserve">    idTrainingProgram</w:t>
         <w:br/>
         <w:t xml:space="preserve">    name</w:t>
         <w:br/>
-        <w:t xml:space="preserve">    email</w:t>
+        <w:t xml:space="preserve">    type</w:t>
+        <w:br/>
+        <w:t xml:space="preserve">    difficultyLevel</w:t>
         <w:br/>
         <w:t xml:space="preserve">  }</w:t>
         <w:br/>
@@ -15509,7 +15520,7 @@
       </w:pPr>
       <w:r>
         <w:rPr/>
-        <w:t xml:space="preserve">Перед повторной отправкой Листинга 15 тестовый ключ auth:session:{jti} удаляется командой redis-cli. Ожидаемый результат – HTTP 401 с сообщением Active session not found. Please authenticate again. После повторного login запрос снова выполняется.</w:t>
+        <w:t xml:space="preserve">Ожидается HTTP 401 с сообщением Active session not found. Please authenticate again. После повторного выполнения Листинга 12 создаётся новая сессия, и Листинг 13 снова выполняется успешно.</w:t>
       </w:r>
     </w:p>
     <w:p>

</xml_diff>

<commit_message>
docs: expand role implementation section
</commit_message>
<xml_diff>
--- a/docs/lab5-p1-p2.docx
+++ b/docs/lab5-p1-p2.docx
@@ -15589,7 +15589,7 @@
       </w:pPr>
       <w:r>
         <w:rPr/>
-        <w:t xml:space="preserve">В Auth Service роли client, trainer и admin хранятся в справочнике auth_role. Учётная запись содержит ссылку на роль. После аутентификации роль включается в JWT и в активную Redis-сессию, а API Gateway получает её через SessionUserDto. Публичная регистрация допускает только client и trainer; роль admin назначается административной операцией.</w:t>
+        <w:t xml:space="preserve">В системе используются три роли: client, trainer и admin. Роль определяет набор действий, которые пользователь может выполнять через GraphQL API. Роли являются частью модели аутентификации, поэтому назначаются и проверяются централизованно в Auth Service, а API Gateway получает уже проверенное значение роли.</w:t>
       </w:r>
     </w:p>
     <w:p>
@@ -15597,10 +15597,19 @@
         <w:jc w:val="both"/>
       </w:pPr>
       <w:r>
+        <w:rPr/>
+        <w:t xml:space="preserve">Справочник ролей хранится отдельно от учётных записей. В таблице auth_user находится внешний ключ id_role, который связывает пользователя с записью в auth_role. Благодаря этому роль не передаётся как произвольная строка в каждом запросе к бизнес-сервису и может использоваться в единых правилах авторизации.</w:t>
+      </w:r>
+    </w:p>
+    <w:p>
+      <w:pPr>
+        <w:jc w:val="both"/>
+      </w:pPr>
+      <w:r>
         <w:rPr>
           <w:b/>
         </w:rPr>
-        <w:t xml:space="preserve">Листинг 16 – набор ролей в базе данных</w:t>
+        <w:t xml:space="preserve">Листинг 16 – создание таблиц ролей и пользователей</w:t>
       </w:r>
     </w:p>
     <w:p>
@@ -15613,7 +15622,35 @@
           <w:rFonts w:ascii="Courier New" w:hAnsi="Courier New" w:eastAsia="Courier New"/>
           <w:sz w:val="18"/>
         </w:rPr>
-        <w:t xml:space="preserve">INSERT INTO auth_role (name) VALUES ('client'), ('trainer'), ('admin');</w:t>
+        <w:t xml:space="preserve">CREATE TABLE auth_role (</w:t>
+        <w:br/>
+        <w:t xml:space="preserve">    id_role BIGINT AUTO_INCREMENT PRIMARY KEY,</w:t>
+        <w:br/>
+        <w:t xml:space="preserve">    name VARCHAR(30) NOT NULL UNIQUE</w:t>
+        <w:br/>
+        <w:t xml:space="preserve">) ENGINE=InnoDB DEFAULT CHARSET=utf8mb4;</w:t>
+        <w:br/>
+        <w:t xml:space="preserve"/>
+        <w:br/>
+        <w:t xml:space="preserve">CREATE TABLE auth_user (</w:t>
+        <w:br/>
+        <w:t xml:space="preserve">    id_user BIGINT AUTO_INCREMENT PRIMARY KEY,</w:t>
+        <w:br/>
+        <w:t xml:space="preserve">    id_role BIGINT NOT NULL,</w:t>
+        <w:br/>
+        <w:t xml:space="preserve">    name VARCHAR(100) NOT NULL,</w:t>
+        <w:br/>
+        <w:t xml:space="preserve">    email VARCHAR(150) NOT NULL UNIQUE,</w:t>
+        <w:br/>
+        <w:t xml:space="preserve">    password_hash VARCHAR(255) NOT NULL,</w:t>
+        <w:br/>
+        <w:t xml:space="preserve">    phone VARCHAR(30),</w:t>
+        <w:br/>
+        <w:t xml:space="preserve">    CONSTRAINT fk_auth_user_role</w:t>
+        <w:br/>
+        <w:t xml:space="preserve">        FOREIGN KEY (id_role) REFERENCES auth_role(id_role)</w:t>
+        <w:br/>
+        <w:t xml:space="preserve">) ENGINE=InnoDB DEFAULT CHARSET=utf8mb4;</w:t>
       </w:r>
     </w:p>
     <w:p>
@@ -15624,7 +15661,7 @@
         <w:rPr>
           <w:b/>
         </w:rPr>
-        <w:t xml:space="preserve">Листинг 17 – роль проверенной сессии</w:t>
+        <w:t xml:space="preserve">Листинг 17 – заполнение справочника ролей</w:t>
       </w:r>
     </w:p>
     <w:p>
@@ -15637,7 +15674,111 @@
           <w:rFonts w:ascii="Courier New" w:hAnsi="Courier New" w:eastAsia="Courier New"/>
           <w:sz w:val="18"/>
         </w:rPr>
-        <w:t xml:space="preserve">public record SessionUserDto(Long userId, String email, String role) {</w:t>
+        <w:t xml:space="preserve">INSERT INTO auth_role (name)</w:t>
+        <w:br/>
+        <w:t xml:space="preserve">VALUES ('client'), ('trainer'), ('admin');</w:t>
+      </w:r>
+    </w:p>
+    <w:p>
+      <w:pPr>
+        <w:jc w:val="both"/>
+      </w:pPr>
+      <w:r>
+        <w:rPr/>
+        <w:t xml:space="preserve">Роли создаются миграцией Flyway V2__seed_roles.sql. Ограничение UNIQUE для поля name не позволяет создать две одинаковые роли. При регистрации пользователя открытый API разрешает только client и trainer. Это предотвращает самостоятельное получение административных прав.</w:t>
+      </w:r>
+    </w:p>
+    <w:p>
+      <w:pPr>
+        <w:jc w:val="both"/>
+      </w:pPr>
+      <w:r>
+        <w:rPr>
+          <w:b/>
+        </w:rPr>
+        <w:t xml:space="preserve">Листинг 18 – проверка роли при регистрации</w:t>
+      </w:r>
+    </w:p>
+    <w:p>
+      <w:pPr>
+        <w:jc w:val="both"/>
+        <w:shd w:fill="F2F2F2"/>
+      </w:pPr>
+      <w:r>
+        <w:rPr>
+          <w:rFonts w:ascii="Courier New" w:hAnsi="Courier New" w:eastAsia="Courier New"/>
+          <w:sz w:val="18"/>
+        </w:rPr>
+        <w:t xml:space="preserve">public record RegisterRequest(</w:t>
+        <w:br/>
+        <w:t xml:space="preserve">        @NotBlank String name,</w:t>
+        <w:br/>
+        <w:t xml:space="preserve">        @Email @NotBlank String email,</w:t>
+        <w:br/>
+        <w:t xml:space="preserve">        @Size(min = 8, max = 72) String password,</w:t>
+        <w:br/>
+        <w:t xml:space="preserve">        @NotBlank @Pattern(regexp = "(?i)client|trainer") String role,</w:t>
+        <w:br/>
+        <w:t xml:space="preserve">        String phone</w:t>
+        <w:br/>
+        <w:t xml:space="preserve">) { }</w:t>
+      </w:r>
+    </w:p>
+    <w:p>
+      <w:pPr>
+        <w:jc w:val="both"/>
+      </w:pPr>
+      <w:r>
+        <w:rPr/>
+        <w:t xml:space="preserve">После проверки входных данных AuthenticationService получает роль из RoleRepository. Если роль существует, она связывается с новой сущностью AuthUser. Пароль сохраняется только в виде BCrypt-хеша, а объект роли сохраняется через внешний ключ.</w:t>
+      </w:r>
+    </w:p>
+    <w:p>
+      <w:pPr>
+        <w:jc w:val="both"/>
+      </w:pPr>
+      <w:r>
+        <w:rPr>
+          <w:b/>
+        </w:rPr>
+        <w:t xml:space="preserve">Листинг 19 – связь пользователя с ролью</w:t>
+      </w:r>
+    </w:p>
+    <w:p>
+      <w:pPr>
+        <w:jc w:val="both"/>
+        <w:shd w:fill="F2F2F2"/>
+      </w:pPr>
+      <w:r>
+        <w:rPr>
+          <w:rFonts w:ascii="Courier New" w:hAnsi="Courier New" w:eastAsia="Courier New"/>
+          <w:sz w:val="18"/>
+        </w:rPr>
+        <w:t xml:space="preserve">@Entity</w:t>
+        <w:br/>
+        <w:t xml:space="preserve">@Table(name = "auth_user")</w:t>
+        <w:br/>
+        <w:t xml:space="preserve">public class AuthUser {</w:t>
+        <w:br/>
+        <w:t xml:space="preserve">    @Id</w:t>
+        <w:br/>
+        <w:t xml:space="preserve">    @GeneratedValue(strategy = GenerationType.IDENTITY)</w:t>
+        <w:br/>
+        <w:t xml:space="preserve">    @Column(name = "id_user")</w:t>
+        <w:br/>
+        <w:t xml:space="preserve">    private Long idUser;</w:t>
+        <w:br/>
+        <w:t xml:space="preserve"/>
+        <w:br/>
+        <w:t xml:space="preserve">    @ManyToOne(fetch = FetchType.EAGER, optional = false)</w:t>
+        <w:br/>
+        <w:t xml:space="preserve">    @JoinColumn(name = "id_role", nullable = false)</w:t>
+        <w:br/>
+        <w:t xml:space="preserve">    private Role role;</w:t>
+        <w:br/>
+        <w:t xml:space="preserve"/>
+        <w:br/>
+        <w:t xml:space="preserve">    // name, email, passwordHash и phone</w:t>
         <w:br/>
         <w:t xml:space="preserve">}</w:t>
       </w:r>
@@ -15648,7 +15789,113 @@
       </w:pPr>
       <w:r>
         <w:rPr/>
-        <w:t xml:space="preserve">Роль берётся только из проверенной активной сессии. Поэтому клиент не может изменить её, передав произвольное значение в GraphQL-запросе.</w:t>
+        <w:t xml:space="preserve">При успешной аутентификации роль пользователя включается в JWT вместе с идентификатором пользователя, email и временем действия токена. Поэтому при каждом запросе можно определить роль пользователя, но доверять ей можно только после проверки подписи JWT и активной Redis-сессии.</w:t>
+      </w:r>
+    </w:p>
+    <w:p>
+      <w:pPr>
+        <w:jc w:val="both"/>
+      </w:pPr>
+      <w:r>
+        <w:rPr>
+          <w:b/>
+        </w:rPr>
+        <w:t xml:space="preserve">Листинг 20 – добавление роли в JWT</w:t>
+      </w:r>
+    </w:p>
+    <w:p>
+      <w:pPr>
+        <w:jc w:val="both"/>
+        <w:shd w:fill="F2F2F2"/>
+      </w:pPr>
+      <w:r>
+        <w:rPr>
+          <w:rFonts w:ascii="Courier New" w:hAnsi="Courier New" w:eastAsia="Courier New"/>
+          <w:sz w:val="18"/>
+        </w:rPr>
+        <w:t xml:space="preserve">public String generateToken(AuthUser user) {</w:t>
+        <w:br/>
+        <w:t xml:space="preserve">    return Jwts.builder()</w:t>
+        <w:br/>
+        <w:t xml:space="preserve">            .subject(user.getEmail())</w:t>
+        <w:br/>
+        <w:t xml:space="preserve">            .claim("userId", user.getIdUser())</w:t>
+        <w:br/>
+        <w:t xml:space="preserve">            .claim("name", user.getName())</w:t>
+        <w:br/>
+        <w:t xml:space="preserve">            .claim("role", user.getRole().getName())</w:t>
+        <w:br/>
+        <w:t xml:space="preserve">            .issuedAt(new Date())</w:t>
+        <w:br/>
+        <w:t xml:space="preserve">            .expiration(new Date(System.currentTimeMillis() + expirationMs))</w:t>
+        <w:br/>
+        <w:t xml:space="preserve">            .signWith(signingKey)</w:t>
+        <w:br/>
+        <w:t xml:space="preserve">            .compact();</w:t>
+        <w:br/>
+        <w:t xml:space="preserve">}</w:t>
+      </w:r>
+    </w:p>
+    <w:p>
+      <w:pPr>
+        <w:jc w:val="both"/>
+      </w:pPr>
+      <w:r>
+        <w:rPr/>
+        <w:t xml:space="preserve">Для активной сессии в Redis сохраняется та же роль, что и в JWT. При проверке SessionService сравнивает строку сессии с данными токена. Если клиент изменит JWT или попытается передать другую роль в GraphQL-запросе, проверка подписи или проверка сессии завершится ошибкой.</w:t>
+      </w:r>
+    </w:p>
+    <w:p>
+      <w:pPr>
+        <w:jc w:val="both"/>
+      </w:pPr>
+      <w:r>
+        <w:rPr>
+          <w:b/>
+        </w:rPr>
+        <w:t xml:space="preserve">Листинг 21 – передача роли проверенной сессии</w:t>
+      </w:r>
+    </w:p>
+    <w:p>
+      <w:pPr>
+        <w:jc w:val="both"/>
+        <w:shd w:fill="F2F2F2"/>
+      </w:pPr>
+      <w:r>
+        <w:rPr>
+          <w:rFonts w:ascii="Courier New" w:hAnsi="Courier New" w:eastAsia="Courier New"/>
+          <w:sz w:val="18"/>
+        </w:rPr>
+        <w:t xml:space="preserve">public record SessionValidationResponse(</w:t>
+        <w:br/>
+        <w:t xml:space="preserve">        Long userId,</w:t>
+        <w:br/>
+        <w:t xml:space="preserve">        String email,</w:t>
+        <w:br/>
+        <w:t xml:space="preserve">        String role</w:t>
+        <w:br/>
+        <w:t xml:space="preserve">) { }</w:t>
+        <w:br/>
+        <w:t xml:space="preserve"/>
+        <w:br/>
+        <w:t xml:space="preserve">return new SessionValidationResponse(</w:t>
+        <w:br/>
+        <w:t xml:space="preserve">        userId,</w:t>
+        <w:br/>
+        <w:t xml:space="preserve">        email,</w:t>
+        <w:br/>
+        <w:t xml:space="preserve">        role</w:t>
+        <w:br/>
+        <w:t xml:space="preserve">);</w:t>
+      </w:r>
+    </w:p>
+    <w:p>
+      <w:pPr>
+        <w:jc w:val="both"/>
+      </w:pPr>
+      <w:r>
+        <w:rPr/>
+        <w:t xml:space="preserve">API Gateway получает SessionUserDto только после успешного ответа Auth Service. Далее значение role используется GraphQlAuthorizationPolicy для выбора разрешённых Query и Mutation. Таким образом, роль пользователя хранится в базе данных, подписывается в JWT, сверяется с Redis-сессией и только после этого используется для проверки прав.</w:t>
       </w:r>
     </w:p>
     <w:p>

</xml_diff>

<commit_message>
docs: fix report listing numbering
</commit_message>
<xml_diff>
--- a/docs/lab5-p1-p2.docx
+++ b/docs/lab5-p1-p2.docx
@@ -16153,7 +16153,7 @@
         <w:rPr>
           <w:b/>
         </w:rPr>
-        <w:t xml:space="preserve">Листинг 21 – разрешённая операция клиента</w:t>
+        <w:t>Листинг 22 – разрешённая операция клиента</w:t>
       </w:r>
     </w:p>
     <w:p>
@@ -16196,7 +16196,7 @@
         <w:rPr>
           <w:b/>
         </w:rPr>
-        <w:t xml:space="preserve">Листинг 22 – запрещённая для клиента операция тренера</w:t>
+        <w:t>Листинг 23 – запрещённая для клиента операция тренера</w:t>
       </w:r>
     </w:p>
     <w:p>
@@ -16247,7 +16247,7 @@
         <w:rPr>
           <w:b/>
         </w:rPr>
-        <w:t xml:space="preserve">Листинг 23 – разрешённая операция тренера</w:t>
+        <w:t>Листинг 24 – разрешённая операция тренера</w:t>
       </w:r>
     </w:p>
     <w:p>
@@ -16300,7 +16300,7 @@
         <w:rPr>
           <w:b/>
         </w:rPr>
-        <w:t xml:space="preserve">Листинг 24 – Query администратора</w:t>
+        <w:t>Листинг 25 – Query администратора</w:t>
       </w:r>
     </w:p>
     <w:p>

</xml_diff>

<commit_message>
docs: keep listing numbers unique
</commit_message>
<xml_diff>
--- a/docs/lab5-p1-p2.docx
+++ b/docs/lab5-p1-p2.docx
@@ -16082,7 +16082,7 @@
         <w:rPr>
           <w:b/>
         </w:rPr>
-        <w:t xml:space="preserve">Листинг 20 – применение проверки прав в GraphQL-перехватчике</w:t>
+        <w:t>Листинг 26 – применение проверки прав в GraphQL-перехватчике</w:t>
       </w:r>
     </w:p>
     <w:p>
@@ -16153,7 +16153,7 @@
         <w:rPr>
           <w:b/>
         </w:rPr>
-        <w:t>Листинг 22 – разрешённая операция клиента</w:t>
+        <w:t>Листинг 27 – разрешённая операция клиента</w:t>
       </w:r>
     </w:p>
     <w:p>
@@ -16196,7 +16196,7 @@
         <w:rPr>
           <w:b/>
         </w:rPr>
-        <w:t>Листинг 23 – запрещённая для клиента операция тренера</w:t>
+        <w:t>Листинг 28 – запрещённая для клиента операция тренера</w:t>
       </w:r>
     </w:p>
     <w:p>
@@ -16247,7 +16247,7 @@
         <w:rPr>
           <w:b/>
         </w:rPr>
-        <w:t>Листинг 24 – разрешённая операция тренера</w:t>
+        <w:t>Листинг 29 – разрешённая операция тренера</w:t>
       </w:r>
     </w:p>
     <w:p>
@@ -16300,7 +16300,7 @@
         <w:rPr>
           <w:b/>
         </w:rPr>
-        <w:t>Листинг 25 – Query администратора</w:t>
+        <w:t>Листинг 30 – Query администратора</w:t>
       </w:r>
     </w:p>
     <w:p>

</xml_diff>

<commit_message>
docs: rewrite roles section with complete code listings
</commit_message>
<xml_diff>
--- a/docs/lab5-p1-p2.docx
+++ b/docs/lab5-p1-p2.docx
@@ -15589,7 +15589,7 @@
       </w:pPr>
       <w:r>
         <w:rPr/>
-        <w:t xml:space="preserve">В системе используются три роли: client, trainer и admin. Роль определяет набор действий, которые пользователь может выполнять через GraphQL API. Роли являются частью модели аутентификации, поэтому назначаются и проверяются централизованно в Auth Service, а API Gateway получает уже проверенное значение роли.</w:t>
+        <w:t xml:space="preserve">В приложении определены три роли: client, trainer и admin. Роль является частью учётной записи пользователя и определяет доступ к операциям фитнес-платформы. Клиент работает со своими записями, абонементами и прогрессом. Тренер управляет тренировочными программами, расписанием и прогрессом клиентов. Администратор управляет пользователями и получает доступ к аналитическим операциям.</w:t>
       </w:r>
     </w:p>
     <w:p>
@@ -15598,7 +15598,7 @@
       </w:pPr>
       <w:r>
         <w:rPr/>
-        <w:t xml:space="preserve">Справочник ролей хранится отдельно от учётных записей. В таблице auth_user находится внешний ключ id_role, который связывает пользователя с записью в auth_role. Благодаря этому роль не передаётся как произвольная строка в каждом запросе к бизнес-сервису и может использоваться в единых правилах авторизации.</w:t>
+        <w:t xml:space="preserve">Роль не хранится в GraphQL-запросе и не выбирается заново при каждом обращении к API. Она назначается в Auth Service, сохраняется в базе данных и затем проходит весь цикл аутентификации: попадает в JWT, записывается в Redis-сессию и передаётся в API Gateway только после проверки токена и сессии.</w:t>
       </w:r>
     </w:p>
     <w:p>
@@ -15609,7 +15609,7 @@
         <w:rPr>
           <w:b/>
         </w:rPr>
-        <w:t xml:space="preserve">Листинг 16 – создание таблиц ролей и пользователей</w:t>
+        <w:t xml:space="preserve">Листинг 16 – миграция справочника ролей и учётных записей</w:t>
       </w:r>
     </w:p>
     <w:p>
@@ -15651,6 +15651,12 @@
         <w:t xml:space="preserve">        FOREIGN KEY (id_role) REFERENCES auth_role(id_role)</w:t>
         <w:br/>
         <w:t xml:space="preserve">) ENGINE=InnoDB DEFAULT CHARSET=utf8mb4;</w:t>
+        <w:br/>
+        <w:t xml:space="preserve"/>
+        <w:br/>
+        <w:t xml:space="preserve">INSERT INTO auth_role (name)</w:t>
+        <w:br/>
+        <w:t xml:space="preserve">VALUES ('client'), ('trainer'), ('admin');</w:t>
       </w:r>
     </w:p>
     <w:p>
@@ -15658,10 +15664,19 @@
         <w:jc w:val="both"/>
       </w:pPr>
       <w:r>
+        <w:rPr/>
+        <w:t xml:space="preserve">Миграция создаёт две связанные таблицы. В auth_role хранится справочник допустимых ролей, а в auth_user — пользователь и внешний ключ id_role. Ограничение UNIQUE для названия роли исключает дублирование. Внешний ключ не позволяет сохранить пользователя без существующей роли.</w:t>
+      </w:r>
+    </w:p>
+    <w:p>
+      <w:pPr>
+        <w:jc w:val="both"/>
+      </w:pPr>
+      <w:r>
         <w:rPr>
           <w:b/>
         </w:rPr>
-        <w:t xml:space="preserve">Листинг 17 – заполнение справочника ролей</w:t>
+        <w:t xml:space="preserve">Листинг 17 – сущность Role в Auth Service</w:t>
       </w:r>
     </w:p>
     <w:p>
@@ -15674,9 +15689,33 @@
           <w:rFonts w:ascii="Courier New" w:hAnsi="Courier New" w:eastAsia="Courier New"/>
           <w:sz w:val="18"/>
         </w:rPr>
-        <w:t xml:space="preserve">INSERT INTO auth_role (name)</w:t>
-        <w:br/>
-        <w:t xml:space="preserve">VALUES ('client'), ('trainer'), ('admin');</w:t>
+        <w:t xml:space="preserve">@Entity</w:t>
+        <w:br/>
+        <w:t xml:space="preserve">@Table(name = "auth_role")</w:t>
+        <w:br/>
+        <w:t xml:space="preserve">@Getter</w:t>
+        <w:br/>
+        <w:t xml:space="preserve">@NoArgsConstructor</w:t>
+        <w:br/>
+        <w:t xml:space="preserve">public class Role {</w:t>
+        <w:br/>
+        <w:t xml:space="preserve"/>
+        <w:br/>
+        <w:t xml:space="preserve">    @Id</w:t>
+        <w:br/>
+        <w:t xml:space="preserve">    @GeneratedValue(strategy = GenerationType.IDENTITY)</w:t>
+        <w:br/>
+        <w:t xml:space="preserve">    @Column(name = "id_role")</w:t>
+        <w:br/>
+        <w:t xml:space="preserve">    private Long idRole;</w:t>
+        <w:br/>
+        <w:t xml:space="preserve"/>
+        <w:br/>
+        <w:t xml:space="preserve">    @Column(nullable = false, unique = true, length = 30)</w:t>
+        <w:br/>
+        <w:t xml:space="preserve">    private String name;</w:t>
+        <w:br/>
+        <w:t xml:space="preserve">}</w:t>
       </w:r>
     </w:p>
     <w:p>
@@ -15685,7 +15724,7 @@
       </w:pPr>
       <w:r>
         <w:rPr/>
-        <w:t xml:space="preserve">Роли создаются миграцией Flyway V2__seed_roles.sql. Ограничение UNIQUE для поля name не позволяет создать две одинаковые роли. При регистрации пользователя открытый API разрешает только client и trainer. Это предотвращает самостоятельное получение административных прав.</w:t>
+        <w:t xml:space="preserve">Класс Role связывает Java-модель с таблицей auth_role. Поле idRole является первичным ключом, а name содержит значение client, trainer или admin. Аннотация unique дополнительно защищает справочник от одинаковых ролей на уровне базы данных.</w:t>
       </w:r>
     </w:p>
     <w:p>
@@ -15696,7 +15735,7 @@
         <w:rPr>
           <w:b/>
         </w:rPr>
-        <w:t xml:space="preserve">Листинг 18 – проверка роли при регистрации</w:t>
+        <w:t xml:space="preserve">Листинг 18 – связь AuthUser с ролью</w:t>
       </w:r>
     </w:p>
     <w:p>
@@ -15709,19 +15748,65 @@
           <w:rFonts w:ascii="Courier New" w:hAnsi="Courier New" w:eastAsia="Courier New"/>
           <w:sz w:val="18"/>
         </w:rPr>
-        <w:t xml:space="preserve">public record RegisterRequest(</w:t>
-        <w:br/>
-        <w:t xml:space="preserve">        @NotBlank String name,</w:t>
-        <w:br/>
-        <w:t xml:space="preserve">        @Email @NotBlank String email,</w:t>
-        <w:br/>
-        <w:t xml:space="preserve">        @Size(min = 8, max = 72) String password,</w:t>
-        <w:br/>
-        <w:t xml:space="preserve">        @NotBlank @Pattern(regexp = "(?i)client|trainer") String role,</w:t>
-        <w:br/>
-        <w:t xml:space="preserve">        String phone</w:t>
-        <w:br/>
-        <w:t xml:space="preserve">) { }</w:t>
+        <w:t xml:space="preserve">@Entity</w:t>
+        <w:br/>
+        <w:t xml:space="preserve">@Table(name = "auth_user")</w:t>
+        <w:br/>
+        <w:t xml:space="preserve">@Getter</w:t>
+        <w:br/>
+        <w:t xml:space="preserve">@NoArgsConstructor</w:t>
+        <w:br/>
+        <w:t xml:space="preserve">public class AuthUser {</w:t>
+        <w:br/>
+        <w:t xml:space="preserve"/>
+        <w:br/>
+        <w:t xml:space="preserve">    @Id</w:t>
+        <w:br/>
+        <w:t xml:space="preserve">    @GeneratedValue(strategy = GenerationType.IDENTITY)</w:t>
+        <w:br/>
+        <w:t xml:space="preserve">    @Column(name = "id_user")</w:t>
+        <w:br/>
+        <w:t xml:space="preserve">    private Long idUser;</w:t>
+        <w:br/>
+        <w:t xml:space="preserve"/>
+        <w:br/>
+        <w:t xml:space="preserve">    @Column(nullable = false, unique = true, length = 150)</w:t>
+        <w:br/>
+        <w:t xml:space="preserve">    private String email;</w:t>
+        <w:br/>
+        <w:t xml:space="preserve"/>
+        <w:br/>
+        <w:t xml:space="preserve">    @Column(name = "password_hash", nullable = false, length = 100)</w:t>
+        <w:br/>
+        <w:t xml:space="preserve">    private String passwordHash;</w:t>
+        <w:br/>
+        <w:t xml:space="preserve"/>
+        <w:br/>
+        <w:t xml:space="preserve">    @ManyToOne(fetch = FetchType.EAGER, optional = false)</w:t>
+        <w:br/>
+        <w:t xml:space="preserve">    @JoinColumn(name = "id_role", nullable = false)</w:t>
+        <w:br/>
+        <w:t xml:space="preserve">    private Role role;</w:t>
+        <w:br/>
+        <w:t xml:space="preserve"/>
+        <w:br/>
+        <w:t xml:space="preserve">    public AuthUser(String name, String email, String passwordHash,</w:t>
+        <w:br/>
+        <w:t xml:space="preserve">                    String phone, Role role) {</w:t>
+        <w:br/>
+        <w:t xml:space="preserve">        this.name = name;</w:t>
+        <w:br/>
+        <w:t xml:space="preserve">        this.email = email;</w:t>
+        <w:br/>
+        <w:t xml:space="preserve">        this.passwordHash = passwordHash;</w:t>
+        <w:br/>
+        <w:t xml:space="preserve">        this.phone = phone;</w:t>
+        <w:br/>
+        <w:t xml:space="preserve">        this.role = role;</w:t>
+        <w:br/>
+        <w:t xml:space="preserve">    }</w:t>
+        <w:br/>
+        <w:t xml:space="preserve">}</w:t>
       </w:r>
     </w:p>
     <w:p>
@@ -15730,7 +15815,7 @@
       </w:pPr>
       <w:r>
         <w:rPr/>
-        <w:t xml:space="preserve">После проверки входных данных AuthenticationService получает роль из RoleRepository. Если роль существует, она связывается с новой сущностью AuthUser. Пароль сохраняется только в виде BCrypt-хеша, а объект роли сохраняется через внешний ключ.</w:t>
+        <w:t xml:space="preserve">Связь ManyToOne означает, что несколько пользователей могут иметь одну роль, например client. При загрузке AuthUser роль загружается вместе с пользователем. Поэтому AuthenticationService может получить её через user.getRole() и использовать при создании токена.</w:t>
       </w:r>
     </w:p>
     <w:p>
@@ -15741,7 +15826,7 @@
         <w:rPr>
           <w:b/>
         </w:rPr>
-        <w:t xml:space="preserve">Листинг 19 – связь пользователя с ролью</w:t>
+        <w:t xml:space="preserve">Листинг 19 – назначение роли при регистрации и входе</w:t>
       </w:r>
     </w:p>
     <w:p>
@@ -15754,31 +15839,71 @@
           <w:rFonts w:ascii="Courier New" w:hAnsi="Courier New" w:eastAsia="Courier New"/>
           <w:sz w:val="18"/>
         </w:rPr>
-        <w:t xml:space="preserve">@Entity</w:t>
-        <w:br/>
-        <w:t xml:space="preserve">@Table(name = "auth_user")</w:t>
-        <w:br/>
-        <w:t xml:space="preserve">public class AuthUser {</w:t>
-        <w:br/>
-        <w:t xml:space="preserve">    @Id</w:t>
-        <w:br/>
-        <w:t xml:space="preserve">    @GeneratedValue(strategy = GenerationType.IDENTITY)</w:t>
-        <w:br/>
-        <w:t xml:space="preserve">    @Column(name = "id_user")</w:t>
-        <w:br/>
-        <w:t xml:space="preserve">    private Long idUser;</w:t>
+        <w:t xml:space="preserve">@Service</w:t>
+        <w:br/>
+        <w:t xml:space="preserve">@RequiredArgsConstructor</w:t>
+        <w:br/>
+        <w:t xml:space="preserve">public class AuthenticationService {</w:t>
+        <w:br/>
+        <w:t xml:space="preserve">    private final AuthUserRepository userRepository;</w:t>
+        <w:br/>
+        <w:t xml:space="preserve">    private final RoleRepository roleRepository;</w:t>
+        <w:br/>
+        <w:t xml:space="preserve">    private final PasswordEncoder passwordEncoder;</w:t>
+        <w:br/>
+        <w:t xml:space="preserve">    private final JwtService jwtService;</w:t>
+        <w:br/>
+        <w:t xml:space="preserve">    private final SessionService sessionService;</w:t>
         <w:br/>
         <w:t xml:space="preserve"/>
         <w:br/>
-        <w:t xml:space="preserve">    @ManyToOne(fetch = FetchType.EAGER, optional = false)</w:t>
-        <w:br/>
-        <w:t xml:space="preserve">    @JoinColumn(name = "id_role", nullable = false)</w:t>
-        <w:br/>
-        <w:t xml:space="preserve">    private Role role;</w:t>
+        <w:t xml:space="preserve">    @Transactional</w:t>
+        <w:br/>
+        <w:t xml:space="preserve">    public AuthResponse register(RegisterRequest request) {</w:t>
+        <w:br/>
+        <w:t xml:space="preserve">        String email = request.email().trim().toLowerCase(Locale.ROOT);</w:t>
+        <w:br/>
+        <w:t xml:space="preserve">        if (userRepository.existsByEmailIgnoreCase(email)) {</w:t>
+        <w:br/>
+        <w:t xml:space="preserve">            throw new AuthException(HttpStatus.CONFLICT,</w:t>
+        <w:br/>
+        <w:t xml:space="preserve">                    "User with this email already exists");</w:t>
+        <w:br/>
+        <w:t xml:space="preserve">        }</w:t>
         <w:br/>
         <w:t xml:space="preserve"/>
         <w:br/>
-        <w:t xml:space="preserve">    // name, email, passwordHash и phone</w:t>
+        <w:t xml:space="preserve">        Role role = roleRepository.findByNameIgnoreCase(request.role())</w:t>
+        <w:br/>
+        <w:t xml:space="preserve">                .orElseThrow(() -&gt; new AuthException(</w:t>
+        <w:br/>
+        <w:t xml:space="preserve">                        HttpStatus.BAD_REQUEST, "Unknown role"));</w:t>
+        <w:br/>
+        <w:t xml:space="preserve"/>
+        <w:br/>
+        <w:t xml:space="preserve">        AuthUser user = userRepository.save(new AuthUser(</w:t>
+        <w:br/>
+        <w:t xml:space="preserve">                request.name().trim(), email,</w:t>
+        <w:br/>
+        <w:t xml:space="preserve">                passwordEncoder.encode(request.password()),</w:t>
+        <w:br/>
+        <w:t xml:space="preserve">                request.phone(), role));</w:t>
+        <w:br/>
+        <w:t xml:space="preserve">        return responseFor(user);</w:t>
+        <w:br/>
+        <w:t xml:space="preserve">    }</w:t>
+        <w:br/>
+        <w:t xml:space="preserve"/>
+        <w:br/>
+        <w:t xml:space="preserve">    private AuthResponse responseFor(AuthUser user) {</w:t>
+        <w:br/>
+        <w:t xml:space="preserve">        String token = jwtService.generateToken(user);</w:t>
+        <w:br/>
+        <w:t xml:space="preserve">        sessionService.createSession(token, user);</w:t>
+        <w:br/>
+        <w:t xml:space="preserve">        return new AuthResponse(token, UserResponse.from(user));</w:t>
+        <w:br/>
+        <w:t xml:space="preserve">    }</w:t>
         <w:br/>
         <w:t xml:space="preserve">}</w:t>
       </w:r>
@@ -15789,7 +15914,7 @@
       </w:pPr>
       <w:r>
         <w:rPr/>
-        <w:t xml:space="preserve">При успешной аутентификации роль пользователя включается в JWT вместе с идентификатором пользователя, email и временем действия токена. Поэтому при каждом запросе можно определить роль пользователя, но доверять ей можно только после проверки подписи JWT и активной Redis-сессии.</w:t>
+        <w:t xml:space="preserve">При регистрации RoleRepository находит существующую роль по имени и передаёт её в конструктор AuthUser. Публичная RegisterRequest дополнительно ограничивает значение роли client или trainer. Поэтому admin не может получить права самостоятельно через обычную регистрацию и назначается отдельной административной операцией.</w:t>
       </w:r>
     </w:p>
     <w:p>
@@ -15800,7 +15925,7 @@
         <w:rPr>
           <w:b/>
         </w:rPr>
-        <w:t xml:space="preserve">Листинг 20 – добавление роли в JWT</w:t>
+        <w:t xml:space="preserve">Листинг 20 – включение роли в JWT</w:t>
       </w:r>
     </w:p>
     <w:p>
@@ -15815,6 +15940,8 @@
         </w:rPr>
         <w:t xml:space="preserve">public String generateToken(AuthUser user) {</w:t>
         <w:br/>
+        <w:t xml:space="preserve">    Instant now = Instant.now();</w:t>
+        <w:br/>
         <w:t xml:space="preserve">    return Jwts.builder()</w:t>
         <w:br/>
         <w:t xml:space="preserve">            .subject(user.getEmail())</w:t>
@@ -15825,9 +15952,11 @@
         <w:br/>
         <w:t xml:space="preserve">            .claim("role", user.getRole().getName())</w:t>
         <w:br/>
-        <w:t xml:space="preserve">            .issuedAt(new Date())</w:t>
-        <w:br/>
-        <w:t xml:space="preserve">            .expiration(new Date(System.currentTimeMillis() + expirationMs))</w:t>
+        <w:t xml:space="preserve">            .id(UUID.randomUUID().toString())</w:t>
+        <w:br/>
+        <w:t xml:space="preserve">            .issuedAt(Date.from(now))</w:t>
+        <w:br/>
+        <w:t xml:space="preserve">            .expiration(Date.from(now.plusMillis(expirationMs)))</w:t>
         <w:br/>
         <w:t xml:space="preserve">            .signWith(signingKey)</w:t>
         <w:br/>
@@ -15842,7 +15971,7 @@
       </w:pPr>
       <w:r>
         <w:rPr/>
-        <w:t xml:space="preserve">Для активной сессии в Redis сохраняется та же роль, что и в JWT. При проверке SessionService сравнивает строку сессии с данными токена. Если клиент изменит JWT или попытается передать другую роль в GraphQL-запросе, проверка подписи или проверка сессии завершится ошибкой.</w:t>
+        <w:t xml:space="preserve">В JWT роль записывается в claim role. Одновременно генерируется уникальный jti, по которому создаётся Redis-сессия. JWT подписывается секретным ключом, поэтому пользователь не может заменить client на admin простым редактированием содержимого токена.</w:t>
       </w:r>
     </w:p>
     <w:p>
@@ -15853,7 +15982,7 @@
         <w:rPr>
           <w:b/>
         </w:rPr>
-        <w:t xml:space="preserve">Листинг 21 – передача роли проверенной сессии</w:t>
+        <w:t xml:space="preserve">Листинг 21 – DTO результата проверки активной сессии</w:t>
       </w:r>
     </w:p>
     <w:p>
@@ -15878,13 +16007,15 @@
         <w:br/>
         <w:t xml:space="preserve"/>
         <w:br/>
+        <w:t xml:space="preserve">// результат SessionService после проверки JWT и Redis</w:t>
+        <w:br/>
         <w:t xml:space="preserve">return new SessionValidationResponse(</w:t>
         <w:br/>
-        <w:t xml:space="preserve">        userId,</w:t>
-        <w:br/>
-        <w:t xml:space="preserve">        email,</w:t>
-        <w:br/>
-        <w:t xml:space="preserve">        role</w:t>
+        <w:t xml:space="preserve">        claims.get("userId", Long.class),</w:t>
+        <w:br/>
+        <w:t xml:space="preserve">        claims.getSubject(),</w:t>
+        <w:br/>
+        <w:t xml:space="preserve">        claims.get("role", String.class)</w:t>
         <w:br/>
         <w:t xml:space="preserve">);</w:t>
       </w:r>
@@ -15895,7 +16026,7 @@
       </w:pPr>
       <w:r>
         <w:rPr/>
-        <w:t xml:space="preserve">API Gateway получает SessionUserDto только после успешного ответа Auth Service. Далее значение role используется GraphQlAuthorizationPolicy для выбора разрешённых Query и Mutation. Таким образом, роль пользователя хранится в базе данных, подписывается в JWT, сверяется с Redis-сессией и только после этого используется для проверки прав.</w:t>
+        <w:t xml:space="preserve">Auth Service возвращает эти сведения API Gateway только после проверки подписи JWT, срока действия токена и наличия Redis-ключа auth:session:{jti}. Gateway сохраняет результат в SessionUserDto и использует его для GraphQlAuthorizationPolicy. Поэтому роль берётся не из произвольного аргумента GraphQL, а из проверенной серверной сессии.</w:t>
       </w:r>
     </w:p>
     <w:p>

</xml_diff>

<commit_message>
feat: secure GraphQL operations with session context
</commit_message>
<xml_diff>
--- a/docs/lab5-p1-p2.docx
+++ b/docs/lab5-p1-p2.docx
@@ -16537,89 +16537,523 @@
     </w:p>
     <w:p>
       <w:pPr>
-        <w:spacing w:after="0" w:line="240" w:lineRule="auto"/>
-        <w:ind w:firstLine="709"/>
-        <w:jc w:val="both"/>
-        <w:rPr>
-          <w:rFonts w:ascii="Times New Roman" w:hAnsi="Times New Roman" w:cs="Times New Roman"/>
-          <w:sz w:val="28"/>
-          <w:szCs w:val="28"/>
-        </w:rPr>
-      </w:pPr>
-      <w:r>
-        <w:rPr>
-          <w:rFonts w:ascii="Times New Roman" w:hAnsi="Times New Roman" w:cs="Times New Roman"/>
-          <w:sz w:val="28"/>
-          <w:szCs w:val="28"/>
-        </w:rPr>
-        <w:t>•</w:t>
-      </w:r>
-      <w:r>
-        <w:rPr>
-          <w:rFonts w:ascii="Times New Roman" w:hAnsi="Times New Roman" w:cs="Times New Roman"/>
-          <w:sz w:val="28"/>
-          <w:szCs w:val="28"/>
-        </w:rPr>
-        <w:tab/>
-        <w:t>проверять JWT-токен при обращении к защищённым операциям;</w:t>
-      </w:r>
-    </w:p>
-    <w:p>
-      <w:pPr>
-        <w:spacing w:after="0" w:line="240" w:lineRule="auto"/>
-        <w:ind w:firstLine="709"/>
-        <w:jc w:val="both"/>
-        <w:rPr>
-          <w:rFonts w:ascii="Times New Roman" w:hAnsi="Times New Roman" w:cs="Times New Roman"/>
-          <w:sz w:val="28"/>
-          <w:szCs w:val="28"/>
-        </w:rPr>
-      </w:pPr>
-      <w:r>
-        <w:rPr>
-          <w:rFonts w:ascii="Times New Roman" w:hAnsi="Times New Roman" w:cs="Times New Roman"/>
-          <w:sz w:val="28"/>
-          <w:szCs w:val="28"/>
-        </w:rPr>
-        <w:t>•</w:t>
-      </w:r>
-      <w:r>
-        <w:rPr>
-          <w:rFonts w:ascii="Times New Roman" w:hAnsi="Times New Roman" w:cs="Times New Roman"/>
-          <w:sz w:val="28"/>
-          <w:szCs w:val="28"/>
-        </w:rPr>
-        <w:tab/>
-        <w:t>запрещать доступ к операциям без действующей сессии;</w:t>
-      </w:r>
-    </w:p>
-    <w:p>
-      <w:pPr>
-        <w:spacing w:after="0" w:line="240" w:lineRule="auto"/>
-        <w:ind w:firstLine="709"/>
-        <w:jc w:val="both"/>
-        <w:rPr>
-          <w:rFonts w:ascii="Times New Roman" w:hAnsi="Times New Roman" w:cs="Times New Roman"/>
-          <w:sz w:val="28"/>
-          <w:szCs w:val="28"/>
-        </w:rPr>
-      </w:pPr>
-      <w:r>
-        <w:rPr>
-          <w:rFonts w:ascii="Times New Roman" w:hAnsi="Times New Roman" w:cs="Times New Roman"/>
-          <w:sz w:val="28"/>
-          <w:szCs w:val="28"/>
-        </w:rPr>
-        <w:t>•</w:t>
-      </w:r>
-      <w:r>
-        <w:rPr>
-          <w:rFonts w:ascii="Times New Roman" w:hAnsi="Times New Roman" w:cs="Times New Roman"/>
-          <w:sz w:val="28"/>
-          <w:szCs w:val="28"/>
-        </w:rPr>
-        <w:tab/>
-        <w:t>передавать информацию о пользователе и его роли в сервисный слой.</w:t>
+        <w:jc w:val="both"/>
+      </w:pPr>
+      <w:r>
+        <w:rPr>
+          <w:b/>
+        </w:rPr>
+        <w:t xml:space="preserve">4.1. Проверять JWT-токен при обращении к защищённым операциям</w:t>
+      </w:r>
+    </w:p>
+    <w:p>
+      <w:pPr>
+        <w:jc w:val="both"/>
+      </w:pPr>
+      <w:r>
+        <w:rPr/>
+        <w:t xml:space="preserve">API Gateway является единой точкой входа GraphQL. Перед выполнением каждой защищённой Query или Mutation он запускает GraphQlAuthenticationInterceptor. Открытыми остаются только register и login. Для остальных операций шлюз извлекает заголовок Authorization, передаёт Bearer-токен в Auth Service и получает сведения о проверенном пользователе.</w:t>
+      </w:r>
+    </w:p>
+    <w:p>
+      <w:pPr>
+        <w:jc w:val="both"/>
+      </w:pPr>
+      <w:r>
+        <w:rPr>
+          <w:b/>
+        </w:rPr>
+        <w:t xml:space="preserve">Листинг 31 – проверка JWT в GraphQL-перехватчике</w:t>
+      </w:r>
+    </w:p>
+    <w:p>
+      <w:pPr>
+        <w:jc w:val="both"/>
+        <w:shd w:fill="F2F2F2"/>
+      </w:pPr>
+      <w:r>
+        <w:rPr>
+          <w:rFonts w:ascii="Courier New" w:hAnsi="Courier New" w:eastAsia="Courier New"/>
+          <w:sz w:val="18"/>
+        </w:rPr>
+        <w:t xml:space="preserve">@Override</w:t>
+        <w:br/>
+        <w:t xml:space="preserve">public Mono&lt;WebGraphQlResponse&gt; intercept(</w:t>
+        <w:br/>
+        <w:t xml:space="preserve">        WebGraphQlRequest request, Chain chain) {</w:t>
+        <w:br/>
+        <w:t xml:space="preserve">    if (authorizationPolicy.isPublicOperation(request.getDocument())) {</w:t>
+        <w:br/>
+        <w:t xml:space="preserve">        return chain.next(request);</w:t>
+        <w:br/>
+        <w:t xml:space="preserve">    }</w:t>
+        <w:br/>
+        <w:t xml:space="preserve"/>
+        <w:br/>
+        <w:t xml:space="preserve">    String authorizationHeader = request.getHeaders()</w:t>
+        <w:br/>
+        <w:t xml:space="preserve">            .getFirst(HttpHeaders.AUTHORIZATION);</w:t>
+        <w:br/>
+        <w:t xml:space="preserve">    SessionUserDto authenticatedUser;</w:t>
+        <w:br/>
+        <w:t xml:space="preserve">    try {</w:t>
+        <w:br/>
+        <w:t xml:space="preserve">        authenticatedUser = authServiceClient</w:t>
+        <w:br/>
+        <w:t xml:space="preserve">                .validateSession(authorizationHeader);</w:t>
+        <w:br/>
+        <w:t xml:space="preserve">    } catch (IllegalArgumentException exception) {</w:t>
+        <w:br/>
+        <w:t xml:space="preserve">        return Mono.error(new ResponseStatusException(</w:t>
+        <w:br/>
+        <w:t xml:space="preserve">                HttpStatus.UNAUTHORIZED, exception.getMessage()));</w:t>
+        <w:br/>
+        <w:t xml:space="preserve">    }</w:t>
+        <w:br/>
+        <w:t xml:space="preserve">    // дальнейшая проверка прав и передача контекста</w:t>
+        <w:br/>
+        <w:t xml:space="preserve">}</w:t>
+      </w:r>
+    </w:p>
+    <w:p>
+      <w:pPr>
+        <w:jc w:val="both"/>
+      </w:pPr>
+      <w:r>
+        <w:rPr/>
+        <w:t xml:space="preserve">Auth Service проверяет формат Bearer-токена, подпись HS384 и срок действия claim exp. Некорректный, изменённый или просроченный JWT не проходит проверку. В этом случае GraphQL-операция не запускается, а клиент получает HTTP 401 Unauthorized.</w:t>
+      </w:r>
+    </w:p>
+    <w:p>
+      <w:pPr>
+        <w:jc w:val="both"/>
+      </w:pPr>
+      <w:r>
+        <w:rPr>
+          <w:b/>
+        </w:rPr>
+        <w:t xml:space="preserve">4.2. Запрещать доступ к операциям без действующей сессии</w:t>
+      </w:r>
+    </w:p>
+    <w:p>
+      <w:pPr>
+        <w:jc w:val="both"/>
+      </w:pPr>
+      <w:r>
+        <w:rPr/>
+        <w:t xml:space="preserve">Одного действительного JWT недостаточно. После проверки подписи Auth Service извлекает jti токена и ищет ключ auth:session:{jti} в Redis. Если ключ отсутствует, истёк или не совпадает с данными JWT, сессия считается завершённой. Это позволяет потребовать повторный вход даже до окончания срока действия самого токена.</w:t>
+      </w:r>
+    </w:p>
+    <w:p>
+      <w:pPr>
+        <w:jc w:val="both"/>
+      </w:pPr>
+      <w:r>
+        <w:rPr>
+          <w:b/>
+        </w:rPr>
+        <w:t xml:space="preserve">Листинг 32 – проверка Redis-сессии</w:t>
+      </w:r>
+    </w:p>
+    <w:p>
+      <w:pPr>
+        <w:jc w:val="both"/>
+        <w:shd w:fill="F2F2F2"/>
+      </w:pPr>
+      <w:r>
+        <w:rPr>
+          <w:rFonts w:ascii="Courier New" w:hAnsi="Courier New" w:eastAsia="Courier New"/>
+          <w:sz w:val="18"/>
+        </w:rPr>
+        <w:t xml:space="preserve">public SessionValidationResponse validateSession(</w:t>
+        <w:br/>
+        <w:t xml:space="preserve">        String authorizationHeader) {</w:t>
+        <w:br/>
+        <w:t xml:space="preserve">    String token = extractBearerToken(authorizationHeader);</w:t>
+        <w:br/>
+        <w:t xml:space="preserve">    Claims claims = jwtService.parseClaims(token);</w:t>
+        <w:br/>
+        <w:t xml:space="preserve">    String storedSession = redisTemplate.opsForValue()</w:t>
+        <w:br/>
+        <w:t xml:space="preserve">            .get(keyFor(claims));</w:t>
+        <w:br/>
+        <w:t xml:space="preserve">    if (storedSession == null) {</w:t>
+        <w:br/>
+        <w:t xml:space="preserve">        throw reauthenticationRequired();</w:t>
+        <w:br/>
+        <w:t xml:space="preserve">    }</w:t>
+        <w:br/>
+        <w:t xml:space="preserve"/>
+        <w:br/>
+        <w:t xml:space="preserve">    Long userId = claims.get("userId", Long.class);</w:t>
+        <w:br/>
+        <w:t xml:space="preserve">    String email = claims.getSubject();</w:t>
+        <w:br/>
+        <w:t xml:space="preserve">    String role = claims.get("role", String.class);</w:t>
+        <w:br/>
+        <w:t xml:space="preserve">    String expectedSession = userId + "|" + email + "|" + role;</w:t>
+        <w:br/>
+        <w:t xml:space="preserve">    if (!expectedSession.equals(storedSession)) {</w:t>
+        <w:br/>
+        <w:t xml:space="preserve">        throw reauthenticationRequired();</w:t>
+        <w:br/>
+        <w:t xml:space="preserve">    }</w:t>
+        <w:br/>
+        <w:t xml:space="preserve">    return new SessionValidationResponse(userId, email, role);</w:t>
+        <w:br/>
+        <w:t xml:space="preserve">}</w:t>
+      </w:r>
+    </w:p>
+    <w:p>
+      <w:pPr>
+        <w:jc w:val="both"/>
+      </w:pPr>
+      <w:r>
+        <w:rPr/>
+        <w:t xml:space="preserve">При отсутствии активной сессии формируется сообщение Active session not found. Please authenticate again и HTTP 401. Поэтому удаление Redis-ключа завершает доступ пользователя к защищённым операциям.</w:t>
+      </w:r>
+    </w:p>
+    <w:p>
+      <w:pPr>
+        <w:jc w:val="both"/>
+      </w:pPr>
+      <w:r>
+        <w:rPr>
+          <w:b/>
+        </w:rPr>
+        <w:t xml:space="preserve">4.3. Передавать информацию о пользователе и его роли в сервисный слой</w:t>
+      </w:r>
+    </w:p>
+    <w:p>
+      <w:pPr>
+        <w:jc w:val="both"/>
+      </w:pPr>
+      <w:r>
+        <w:rPr/>
+        <w:t xml:space="preserve">После успешной проверки Auth Service возвращает идентификатор пользователя, email и роль. API Gateway помещает эти сведения в GraphQL-контекст. Обработчики личных операций получают SessionUserDto из контекста, а затем передают userId в сервис бронирований или тренировок. Идентификатор клиента больше не задаётся константой в коде.</w:t>
+      </w:r>
+    </w:p>
+    <w:p>
+      <w:pPr>
+        <w:jc w:val="both"/>
+      </w:pPr>
+      <w:r>
+        <w:rPr>
+          <w:b/>
+        </w:rPr>
+        <w:t xml:space="preserve">Листинг 33 – сохранение проверенного пользователя в GraphQL-контексте</w:t>
+      </w:r>
+    </w:p>
+    <w:p>
+      <w:pPr>
+        <w:jc w:val="both"/>
+        <w:shd w:fill="F2F2F2"/>
+      </w:pPr>
+      <w:r>
+        <w:rPr>
+          <w:rFonts w:ascii="Courier New" w:hAnsi="Courier New" w:eastAsia="Courier New"/>
+          <w:sz w:val="18"/>
+        </w:rPr>
+        <w:t xml:space="preserve">request.configureExecutionInput((executionInput, builder) -&gt; builder</w:t>
+        <w:br/>
+        <w:t xml:space="preserve">        .graphQLContext(context -&gt; context.put(</w:t>
+        <w:br/>
+        <w:t xml:space="preserve">                AUTHENTICATED_USER_CONTEXT_KEY,</w:t>
+        <w:br/>
+        <w:t xml:space="preserve">                authenticatedUser))</w:t>
+        <w:br/>
+        <w:t xml:space="preserve">        .build());</w:t>
+      </w:r>
+    </w:p>
+    <w:p>
+      <w:pPr>
+        <w:jc w:val="both"/>
+      </w:pPr>
+      <w:r>
+        <w:rPr>
+          <w:b/>
+        </w:rPr>
+        <w:t xml:space="preserve">Листинг 34 – использование пользователя в личной операции</w:t>
+      </w:r>
+    </w:p>
+    <w:p>
+      <w:pPr>
+        <w:jc w:val="both"/>
+        <w:shd w:fill="F2F2F2"/>
+      </w:pPr>
+      <w:r>
+        <w:rPr>
+          <w:rFonts w:ascii="Courier New" w:hAnsi="Courier New" w:eastAsia="Courier New"/>
+          <w:sz w:val="18"/>
+        </w:rPr>
+        <w:t xml:space="preserve">@MutationMapping</w:t>
+        <w:br/>
+        <w:t xml:space="preserve">public BookingDto bookWorkout(</w:t>
+        <w:br/>
+        <w:t xml:space="preserve">        @Argument Long workoutId,</w:t>
+        <w:br/>
+        <w:t xml:space="preserve">        @ContextValue(GraphQlAuthenticationInterceptor</w:t>
+        <w:br/>
+        <w:t xml:space="preserve">                .AUTHENTICATED_USER_CONTEXT_KEY)</w:t>
+        <w:br/>
+        <w:t xml:space="preserve">        SessionUserDto authenticatedUser) {</w:t>
+        <w:br/>
+        <w:t xml:space="preserve">    Long clientId = AuthenticatedUserContext</w:t>
+        <w:br/>
+        <w:t xml:space="preserve">            .require(authenticatedUser)</w:t>
+        <w:br/>
+        <w:t xml:space="preserve">            .userId();</w:t>
+        <w:br/>
+        <w:t xml:space="preserve">    return bookingServiceClient.bookWorkout(clientId, workoutId);</w:t>
+        <w:br/>
+        <w:t xml:space="preserve">}</w:t>
+      </w:r>
+    </w:p>
+    <w:p>
+      <w:pPr>
+        <w:jc w:val="both"/>
+      </w:pPr>
+      <w:r>
+        <w:rPr/>
+        <w:t xml:space="preserve">Тот же подход используется для myBookings, mySubscriptions, myPayments, myProgress, cancelBooking и createSubscription. Роль из SessionUserDto передаётся в GraphQlAuthorizationPolicy, который разрешает или запрещает Query и Mutation до вызова обработчика.</w:t>
+      </w:r>
+    </w:p>
+    <w:p>
+      <w:pPr>
+        <w:jc w:val="both"/>
+      </w:pPr>
+      <w:r>
+        <w:rPr>
+          <w:b/>
+        </w:rPr>
+        <w:t xml:space="preserve">4.4. Тестирование защиты GraphQL API</w:t>
+      </w:r>
+    </w:p>
+    <w:p>
+      <w:pPr>
+        <w:jc w:val="both"/>
+      </w:pPr>
+      <w:r>
+        <w:rPr/>
+        <w:t xml:space="preserve">Для защищённых запросов в Altair указывается заголовок Authorization: Bearer &lt;токен_из_login&gt;. Ниже приведены текстовые запросы; изображения запросов и ответов не используются.</w:t>
+      </w:r>
+    </w:p>
+    <w:p>
+      <w:pPr>
+        <w:jc w:val="both"/>
+      </w:pPr>
+      <w:r>
+        <w:rPr>
+          <w:b/>
+        </w:rPr>
+        <w:t xml:space="preserve">Листинг 35 – запрос без JWT</w:t>
+      </w:r>
+    </w:p>
+    <w:p>
+      <w:pPr>
+        <w:jc w:val="both"/>
+        <w:shd w:fill="F2F2F2"/>
+      </w:pPr>
+      <w:r>
+        <w:rPr>
+          <w:rFonts w:ascii="Courier New" w:hAnsi="Courier New" w:eastAsia="Courier New"/>
+          <w:sz w:val="18"/>
+        </w:rPr>
+        <w:t xml:space="preserve">query {</w:t>
+        <w:br/>
+        <w:t xml:space="preserve">  trainingPrograms {</w:t>
+        <w:br/>
+        <w:t xml:space="preserve">    idTrainingProgram</w:t>
+        <w:br/>
+        <w:t xml:space="preserve">    name</w:t>
+        <w:br/>
+        <w:t xml:space="preserve">  }</w:t>
+        <w:br/>
+        <w:t xml:space="preserve">}</w:t>
+      </w:r>
+    </w:p>
+    <w:p>
+      <w:pPr>
+        <w:jc w:val="both"/>
+      </w:pPr>
+      <w:r>
+        <w:rPr/>
+        <w:t xml:space="preserve">Запрос выполняется без заголовка Authorization. Ожидается HTTP 401, так как защищённая операция не получает JWT.</w:t>
+      </w:r>
+    </w:p>
+    <w:p>
+      <w:pPr>
+        <w:jc w:val="both"/>
+      </w:pPr>
+      <w:r>
+        <w:rPr>
+          <w:b/>
+        </w:rPr>
+        <w:t xml:space="preserve">Листинг 36 – запрос с действительным JWT и сессией</w:t>
+      </w:r>
+    </w:p>
+    <w:p>
+      <w:pPr>
+        <w:jc w:val="both"/>
+        <w:shd w:fill="F2F2F2"/>
+      </w:pPr>
+      <w:r>
+        <w:rPr>
+          <w:rFonts w:ascii="Courier New" w:hAnsi="Courier New" w:eastAsia="Courier New"/>
+          <w:sz w:val="18"/>
+        </w:rPr>
+        <w:t xml:space="preserve">query {</w:t>
+        <w:br/>
+        <w:t xml:space="preserve">  trainingPrograms {</w:t>
+        <w:br/>
+        <w:t xml:space="preserve">    idTrainingProgram</w:t>
+        <w:br/>
+        <w:t xml:space="preserve">    name</w:t>
+        <w:br/>
+        <w:t xml:space="preserve">    difficultyLevel</w:t>
+        <w:br/>
+        <w:t xml:space="preserve">  }</w:t>
+        <w:br/>
+        <w:t xml:space="preserve">}</w:t>
+      </w:r>
+    </w:p>
+    <w:p>
+      <w:pPr>
+        <w:jc w:val="both"/>
+      </w:pPr>
+      <w:r>
+        <w:rPr/>
+        <w:t xml:space="preserve">С заголовком Authorization: Bearer &lt;токен&gt; запрос выполняется. Это подтверждает одновременную проверку JWT и Redis-сессии.</w:t>
+      </w:r>
+    </w:p>
+    <w:p>
+      <w:pPr>
+        <w:jc w:val="both"/>
+      </w:pPr>
+      <w:r>
+        <w:rPr>
+          <w:b/>
+        </w:rPr>
+        <w:t xml:space="preserve">Листинг 37 – личный запрос с идентификатором из контекста</w:t>
+      </w:r>
+    </w:p>
+    <w:p>
+      <w:pPr>
+        <w:jc w:val="both"/>
+        <w:shd w:fill="F2F2F2"/>
+      </w:pPr>
+      <w:r>
+        <w:rPr>
+          <w:rFonts w:ascii="Courier New" w:hAnsi="Courier New" w:eastAsia="Courier New"/>
+          <w:sz w:val="18"/>
+        </w:rPr>
+        <w:t xml:space="preserve">query {</w:t>
+        <w:br/>
+        <w:t xml:space="preserve">  myProgress {</w:t>
+        <w:br/>
+        <w:t xml:space="preserve">    idProgress</w:t>
+        <w:br/>
+        <w:t xml:space="preserve">    date</w:t>
+        <w:br/>
+        <w:t xml:space="preserve">    value</w:t>
+        <w:br/>
+        <w:t xml:space="preserve">    trainerComment</w:t>
+        <w:br/>
+        <w:t xml:space="preserve">  }</w:t>
+        <w:br/>
+        <w:t xml:space="preserve">}</w:t>
+      </w:r>
+    </w:p>
+    <w:p>
+      <w:pPr>
+        <w:jc w:val="both"/>
+      </w:pPr>
+      <w:r>
+        <w:rPr/>
+        <w:t xml:space="preserve">Для запроса не передаётся clientId. API Gateway получает идентификатор пользователя из SessionUserDto и передаёт его в сервисный слой. Это исключает подмену идентификатора другого клиента в аргументах GraphQL.</w:t>
+      </w:r>
+    </w:p>
+    <w:p>
+      <w:pPr>
+        <w:jc w:val="both"/>
+      </w:pPr>
+      <w:r>
+        <w:rPr>
+          <w:b/>
+        </w:rPr>
+        <w:t xml:space="preserve">Листинг 38 – запрос после удаления Redis-сессии</w:t>
+      </w:r>
+    </w:p>
+    <w:p>
+      <w:pPr>
+        <w:jc w:val="both"/>
+        <w:shd w:fill="F2F2F2"/>
+      </w:pPr>
+      <w:r>
+        <w:rPr>
+          <w:rFonts w:ascii="Courier New" w:hAnsi="Courier New" w:eastAsia="Courier New"/>
+          <w:sz w:val="18"/>
+        </w:rPr>
+        <w:t xml:space="preserve">query {</w:t>
+        <w:br/>
+        <w:t xml:space="preserve">  trainingPrograms {</w:t>
+        <w:br/>
+        <w:t xml:space="preserve">    idTrainingProgram</w:t>
+        <w:br/>
+        <w:t xml:space="preserve">    name</w:t>
+        <w:br/>
+        <w:t xml:space="preserve">  }</w:t>
+        <w:br/>
+        <w:t xml:space="preserve">}</w:t>
+      </w:r>
+    </w:p>
+    <w:p>
+      <w:pPr>
+        <w:jc w:val="both"/>
+      </w:pPr>
+      <w:r>
+        <w:rPr/>
+        <w:t xml:space="preserve">Перед отправкой удалить ключ auth:session:{jti} командой redis-cli. С тем же JWT запрос возвращает HTTP 401 и требует выполнить login повторно. После нового login создаётся новая сессия, и защищённый запрос снова доступен.</w:t>
+      </w:r>
+    </w:p>
+    <w:p>
+      <w:pPr>
+        <w:jc w:val="both"/>
+      </w:pPr>
+      <w:r>
+        <w:rPr>
+          <w:b/>
+        </w:rPr>
+        <w:t xml:space="preserve">Вывод по пункту 4</w:t>
+      </w:r>
+    </w:p>
+    <w:p>
+      <w:pPr>
+        <w:jc w:val="both"/>
+      </w:pPr>
+      <w:r>
+        <w:rPr/>
+        <w:t xml:space="preserve">GraphQL API защищён проверкой JWT, наличия Redis-сессии и роли пользователя. Неаутентифицированный пользователь не получает доступ к защищённым операциям. Проверенный пользователь и его роль передаются через GraphQL-контекст в сервисный слой, а права на Query и Mutation проверяются до выполнения бизнес-операции.</w:t>
+      </w:r>
+    </w:p>
+    <w:p>
+      <w:pPr>
+        <w:jc w:val="both"/>
+      </w:pPr>
+      <w:r>
+        <w:rPr>
+          <w:b/>
+        </w:rPr>
+        <w:t xml:space="preserve">Общий вывод по лабораторной работе № 5</w:t>
+      </w:r>
+    </w:p>
+    <w:p>
+      <w:pPr>
+        <w:jc w:val="both"/>
+      </w:pPr>
+      <w:r>
+        <w:rPr/>
+        <w:t xml:space="preserve">Реализованы регистрация и вход пользователей, проверка учётных данных, JWT, хранение пользователей и ролей, активные Redis-сессии, ролевая авторизация и защита GraphQL API. Сквозная проверка подтвердила работу пунктов 1–4: корректный вход, отказ при неверном пароле, создание и истечение Redis-сессии, повторную аутентификацию, разграничение ролей client, trainer и admin, а также передачу проверенного пользователя в личные операции.</w:t>
       </w:r>
     </w:p>
     <w:sectPr>

</xml_diff>

<commit_message>
docs: streamline lab 5 GraphQL security section
</commit_message>
<xml_diff>
--- a/docs/lab5-p1-p2.docx
+++ b/docs/lab5-p1-p2.docx
@@ -16552,7 +16552,16 @@
       </w:pPr>
       <w:r>
         <w:rPr/>
-        <w:t xml:space="preserve">API Gateway является единой точкой входа GraphQL. Перед выполнением каждой защищённой Query или Mutation он запускает GraphQlAuthenticationInterceptor. Открытыми остаются только register и login. Для остальных операций шлюз извлекает заголовок Authorization, передаёт Bearer-токен в Auth Service и получает сведения о проверенном пользователе.</w:t>
+        <w:t xml:space="preserve">Механизм выдачи и проверки JWT реализован в пункте 1, а хранение и проверка активной Redis-сессии — в пункте 2. В данном пункте эти механизмы используются API Gateway для защиты GraphQL API. Открытыми остаются только операции register и login. Все остальные Query и Mutation считаются защищёнными.</w:t>
+      </w:r>
+    </w:p>
+    <w:p>
+      <w:pPr>
+        <w:jc w:val="both"/>
+      </w:pPr>
+      <w:r>
+        <w:rPr/>
+        <w:t xml:space="preserve">Перед выполнением защищённой операции GraphQlAuthenticationInterceptor получает заголовок Authorization и передаёт Bearer-токен в Auth Service. Auth Service проверяет подпись и срок действия JWT, затем наличие активной Redis-сессии. Если заголовок отсутствует, токен некорректен, истёк или сессия не найдена, API Gateway возвращает HTTP 401 Unauthorized и не вызывает GraphQL-резолвер.</w:t>
       </w:r>
     </w:p>
     <w:p>
@@ -16563,7 +16572,47 @@
         <w:rPr>
           <w:b/>
         </w:rPr>
-        <w:t xml:space="preserve">Листинг 31 – проверка JWT в GraphQL-перехватчике</w:t>
+        <w:t xml:space="preserve">4.2. Запрещать доступ к операциям без действующей сессии</w:t>
+      </w:r>
+    </w:p>
+    <w:p>
+      <w:pPr>
+        <w:jc w:val="both"/>
+      </w:pPr>
+      <w:r>
+        <w:rPr/>
+        <w:t xml:space="preserve">Проверка JWT сама по себе не даёт доступа к API. После проверки токена Auth Service по его идентификатору jti ищет ключ auth:session:{jti} в Redis. Правила создания ключа, его срока жизни и удаления рассмотрены в пункте 2. Поэтому пользователь с ранее выданным, но отозванным токеном не может выполнить защищённый запрос: ему требуется повторный вход в систему.</w:t>
+      </w:r>
+    </w:p>
+    <w:p>
+      <w:pPr>
+        <w:jc w:val="both"/>
+      </w:pPr>
+      <w:r>
+        <w:rPr>
+          <w:b/>
+        </w:rPr>
+        <w:t xml:space="preserve">4.3. Передавать информацию о пользователе и его роли в сервисный слой</w:t>
+      </w:r>
+    </w:p>
+    <w:p>
+      <w:pPr>
+        <w:jc w:val="both"/>
+      </w:pPr>
+      <w:r>
+        <w:rPr/>
+        <w:t xml:space="preserve">После успешной проверки Auth Service возвращает сведения о текущем пользователе: идентификатор, e-mail и роль. API Gateway сохраняет их в GraphQLContext. Роль используется при разграничении доступа, описанном в пункте 3, а идентификатор пользователя передаётся в личные операции сервисного слоя. Клиент не передаёт свой userId в аргументах запроса и не может подменить его идентификатором другого пользователя.</w:t>
+      </w:r>
+    </w:p>
+    <w:p>
+      <w:pPr>
+        <w:jc w:val="both"/>
+      </w:pPr>
+      <w:r>
+        <w:rPr>
+          <w:b/>
+        </w:rPr>
+        <w:t xml:space="preserve">Листинг 31 – сохранение проверенного пользователя в GraphQLContext</w:t>
       </w:r>
     </w:p>
     <w:p>
@@ -16576,43 +16625,15 @@
           <w:rFonts w:ascii="Courier New" w:hAnsi="Courier New" w:eastAsia="Courier New"/>
           <w:sz w:val="18"/>
         </w:rPr>
-        <w:t xml:space="preserve">@Override</w:t>
-        <w:br/>
-        <w:t xml:space="preserve">public Mono&lt;WebGraphQlResponse&gt; intercept(</w:t>
-        <w:br/>
-        <w:t xml:space="preserve">        WebGraphQlRequest request, Chain chain) {</w:t>
-        <w:br/>
-        <w:t xml:space="preserve">    if (authorizationPolicy.isPublicOperation(request.getDocument())) {</w:t>
-        <w:br/>
-        <w:t xml:space="preserve">        return chain.next(request);</w:t>
-        <w:br/>
-        <w:t xml:space="preserve">    }</w:t>
-        <w:br/>
-        <w:t xml:space="preserve"/>
-        <w:br/>
-        <w:t xml:space="preserve">    String authorizationHeader = request.getHeaders()</w:t>
-        <w:br/>
-        <w:t xml:space="preserve">            .getFirst(HttpHeaders.AUTHORIZATION);</w:t>
-        <w:br/>
-        <w:t xml:space="preserve">    SessionUserDto authenticatedUser;</w:t>
-        <w:br/>
-        <w:t xml:space="preserve">    try {</w:t>
-        <w:br/>
-        <w:t xml:space="preserve">        authenticatedUser = authServiceClient</w:t>
-        <w:br/>
-        <w:t xml:space="preserve">                .validateSession(authorizationHeader);</w:t>
-        <w:br/>
-        <w:t xml:space="preserve">    } catch (IllegalArgumentException exception) {</w:t>
-        <w:br/>
-        <w:t xml:space="preserve">        return Mono.error(new ResponseStatusException(</w:t>
-        <w:br/>
-        <w:t xml:space="preserve">                HttpStatus.UNAUTHORIZED, exception.getMessage()));</w:t>
-        <w:br/>
-        <w:t xml:space="preserve">    }</w:t>
-        <w:br/>
-        <w:t xml:space="preserve">    // дальнейшая проверка прав и передача контекста</w:t>
-        <w:br/>
-        <w:t xml:space="preserve">}</w:t>
+        <w:t xml:space="preserve">request.configureExecutionInput((executionInput, builder) -&gt; builder</w:t>
+        <w:br/>
+        <w:t xml:space="preserve">        .graphQLContext(context -&gt; context.put(</w:t>
+        <w:br/>
+        <w:t xml:space="preserve">                AUTHENTICATED_USER_CONTEXT_KEY,</w:t>
+        <w:br/>
+        <w:t xml:space="preserve">                authenticatedUser))</w:t>
+        <w:br/>
+        <w:t xml:space="preserve">        .build());</w:t>
       </w:r>
     </w:p>
     <w:p>
@@ -16621,7 +16642,7 @@
       </w:pPr>
       <w:r>
         <w:rPr/>
-        <w:t xml:space="preserve">Auth Service проверяет формат Bearer-токена, подпись HS384 и срок действия claim exp. Некорректный, изменённый или просроченный JWT не проходит проверку. В этом случае GraphQL-операция не запускается, а клиент получает HTTP 401 Unauthorized.</w:t>
+        <w:t xml:space="preserve">В контекст помещается SessionUserDto, полученный только после проверки JWT и Redis-сессии. В листинге не повторяется реализация проверки токена и сессии, так как она приведена в пункте 2.</w:t>
       </w:r>
     </w:p>
     <w:p>
@@ -16632,27 +16653,7 @@
         <w:rPr>
           <w:b/>
         </w:rPr>
-        <w:t xml:space="preserve">4.2. Запрещать доступ к операциям без действующей сессии</w:t>
-      </w:r>
-    </w:p>
-    <w:p>
-      <w:pPr>
-        <w:jc w:val="both"/>
-      </w:pPr>
-      <w:r>
-        <w:rPr/>
-        <w:t xml:space="preserve">Одного действительного JWT недостаточно. После проверки подписи Auth Service извлекает jti токена и ищет ключ auth:session:{jti} в Redis. Если ключ отсутствует, истёк или не совпадает с данными JWT, сессия считается завершённой. Это позволяет потребовать повторный вход даже до окончания срока действия самого токена.</w:t>
-      </w:r>
-    </w:p>
-    <w:p>
-      <w:pPr>
-        <w:jc w:val="both"/>
-      </w:pPr>
-      <w:r>
-        <w:rPr>
-          <w:b/>
-        </w:rPr>
-        <w:t xml:space="preserve">Листинг 32 – проверка Redis-сессии</w:t>
+        <w:t xml:space="preserve">Листинг 32 – использование текущего пользователя в сервисном слое</w:t>
       </w:r>
     </w:p>
     <w:p>
@@ -16665,41 +16666,27 @@
           <w:rFonts w:ascii="Courier New" w:hAnsi="Courier New" w:eastAsia="Courier New"/>
           <w:sz w:val="18"/>
         </w:rPr>
-        <w:t xml:space="preserve">public SessionValidationResponse validateSession(</w:t>
-        <w:br/>
-        <w:t xml:space="preserve">        String authorizationHeader) {</w:t>
-        <w:br/>
-        <w:t xml:space="preserve">    String token = extractBearerToken(authorizationHeader);</w:t>
-        <w:br/>
-        <w:t xml:space="preserve">    Claims claims = jwtService.parseClaims(token);</w:t>
-        <w:br/>
-        <w:t xml:space="preserve">    String storedSession = redisTemplate.opsForValue()</w:t>
-        <w:br/>
-        <w:t xml:space="preserve">            .get(keyFor(claims));</w:t>
-        <w:br/>
-        <w:t xml:space="preserve">    if (storedSession == null) {</w:t>
-        <w:br/>
-        <w:t xml:space="preserve">        throw reauthenticationRequired();</w:t>
-        <w:br/>
-        <w:t xml:space="preserve">    }</w:t>
-        <w:br/>
-        <w:t xml:space="preserve"/>
-        <w:br/>
-        <w:t xml:space="preserve">    Long userId = claims.get("userId", Long.class);</w:t>
-        <w:br/>
-        <w:t xml:space="preserve">    String email = claims.getSubject();</w:t>
-        <w:br/>
-        <w:t xml:space="preserve">    String role = claims.get("role", String.class);</w:t>
-        <w:br/>
-        <w:t xml:space="preserve">    String expectedSession = userId + "|" + email + "|" + role;</w:t>
-        <w:br/>
-        <w:t xml:space="preserve">    if (!expectedSession.equals(storedSession)) {</w:t>
-        <w:br/>
-        <w:t xml:space="preserve">        throw reauthenticationRequired();</w:t>
-        <w:br/>
-        <w:t xml:space="preserve">    }</w:t>
-        <w:br/>
-        <w:t xml:space="preserve">    return new SessionValidationResponse(userId, email, role);</w:t>
+        <w:t xml:space="preserve">@MutationMapping</w:t>
+        <w:br/>
+        <w:t xml:space="preserve">public BookingDto bookWorkout(</w:t>
+        <w:br/>
+        <w:t xml:space="preserve">        @Argument BookWorkoutInputDto input,</w:t>
+        <w:br/>
+        <w:t xml:space="preserve">        @ContextValue(GraphQlAuthenticationInterceptor</w:t>
+        <w:br/>
+        <w:t xml:space="preserve">                .AUTHENTICATED_USER_CONTEXT_KEY)</w:t>
+        <w:br/>
+        <w:t xml:space="preserve">        SessionUserDto authenticatedUser) {</w:t>
+        <w:br/>
+        <w:t xml:space="preserve">    Long clientId = AuthenticatedUserContext</w:t>
+        <w:br/>
+        <w:t xml:space="preserve">            .require(authenticatedUser)</w:t>
+        <w:br/>
+        <w:t xml:space="preserve">            .userId();</w:t>
+        <w:br/>
+        <w:t xml:space="preserve">    return bookingServiceClient.bookWorkout(</w:t>
+        <w:br/>
+        <w:t xml:space="preserve">            clientId, input.idWorkout());</w:t>
         <w:br/>
         <w:t xml:space="preserve">}</w:t>
       </w:r>
@@ -16710,7 +16697,7 @@
       </w:pPr>
       <w:r>
         <w:rPr/>
-        <w:t xml:space="preserve">При отсутствии активной сессии формируется сообщение Active session not found. Please authenticate again и HTTP 401. Поэтому удаление Redis-ключа завершает доступ пользователя к защищённым операциям.</w:t>
+        <w:t xml:space="preserve">Метод AuthenticatedUserContext.require() дополнительно проверяет наличие объекта в контексте. При его отсутствии формируется HTTP 401. В сервис бронирований передаётся clientId из проверенной сессии, а не значение, полученное от клиента.</w:t>
       </w:r>
     </w:p>
     <w:p>
@@ -16721,7 +16708,7 @@
         <w:rPr>
           <w:b/>
         </w:rPr>
-        <w:t xml:space="preserve">4.3. Передавать информацию о пользователе и его роли в сервисный слой</w:t>
+        <w:t xml:space="preserve">4.4. Тестирование защиты GraphQL API</w:t>
       </w:r>
     </w:p>
     <w:p>
@@ -16730,7 +16717,7 @@
       </w:pPr>
       <w:r>
         <w:rPr/>
-        <w:t xml:space="preserve">После успешной проверки Auth Service возвращает идентификатор пользователя, email и роль. API Gateway помещает эти сведения в GraphQL-контекст. Обработчики личных операций получают SessionUserDto из контекста, а затем передают userId в сервис бронирований или тренировок. Идентификатор клиента больше не задаётся константой в коде.</w:t>
+        <w:t xml:space="preserve">Для защищённых запросов в Altair в разделе Headers указывается заголовок Authorization: Bearer &lt;токен_из_login&gt;. Запросы регистрации, входа и проверки Redis-сессии уже приведены в пунктах 1–2, поэтому здесь использованы другие проверки, относящиеся к защите GraphQL API.</w:t>
       </w:r>
     </w:p>
     <w:p>
@@ -16741,7 +16728,7 @@
         <w:rPr>
           <w:b/>
         </w:rPr>
-        <w:t xml:space="preserve">Листинг 33 – сохранение проверенного пользователя в GraphQL-контексте</w:t>
+        <w:t xml:space="preserve">Листинг 33 – обращение к защищённой операции без JWT</w:t>
       </w:r>
     </w:p>
     <w:p>
@@ -16754,15 +16741,26 @@
           <w:rFonts w:ascii="Courier New" w:hAnsi="Courier New" w:eastAsia="Courier New"/>
           <w:sz w:val="18"/>
         </w:rPr>
-        <w:t xml:space="preserve">request.configureExecutionInput((executionInput, builder) -&gt; builder</w:t>
-        <w:br/>
-        <w:t xml:space="preserve">        .graphQLContext(context -&gt; context.put(</w:t>
-        <w:br/>
-        <w:t xml:space="preserve">                AUTHENTICATED_USER_CONTEXT_KEY,</w:t>
-        <w:br/>
-        <w:t xml:space="preserve">                authenticatedUser))</w:t>
-        <w:br/>
-        <w:t xml:space="preserve">        .build());</w:t>
+        <w:t xml:space="preserve">query {</w:t>
+        <w:br/>
+        <w:t xml:space="preserve">  trainingPrograms {</w:t>
+        <w:br/>
+        <w:t xml:space="preserve">    idTrainingProgram</w:t>
+        <w:br/>
+        <w:t xml:space="preserve">    title</w:t>
+        <w:br/>
+        <w:t xml:space="preserve">  }</w:t>
+        <w:br/>
+        <w:t xml:space="preserve">}</w:t>
+      </w:r>
+    </w:p>
+    <w:p>
+      <w:pPr>
+        <w:jc w:val="both"/>
+      </w:pPr>
+      <w:r>
+        <w:rPr/>
+        <w:t xml:space="preserve">Запрос отправляется без заголовка Authorization. Ожидаемый результат — HTTP 401 Unauthorized. Это подтверждает, что API Gateway не передаёт неаутентифицированный запрос в резолвер.</w:t>
       </w:r>
     </w:p>
     <w:p>
@@ -16773,7 +16771,7 @@
         <w:rPr>
           <w:b/>
         </w:rPr>
-        <w:t xml:space="preserve">Листинг 34 – использование пользователя в личной операции</w:t>
+        <w:t xml:space="preserve">Листинг 34 – получение собственных данных из GraphQLContext</w:t>
       </w:r>
     </w:p>
     <w:p>
@@ -16786,25 +16784,17 @@
           <w:rFonts w:ascii="Courier New" w:hAnsi="Courier New" w:eastAsia="Courier New"/>
           <w:sz w:val="18"/>
         </w:rPr>
-        <w:t xml:space="preserve">@MutationMapping</w:t>
-        <w:br/>
-        <w:t xml:space="preserve">public BookingDto bookWorkout(</w:t>
-        <w:br/>
-        <w:t xml:space="preserve">        @Argument Long workoutId,</w:t>
-        <w:br/>
-        <w:t xml:space="preserve">        @ContextValue(GraphQlAuthenticationInterceptor</w:t>
-        <w:br/>
-        <w:t xml:space="preserve">                .AUTHENTICATED_USER_CONTEXT_KEY)</w:t>
-        <w:br/>
-        <w:t xml:space="preserve">        SessionUserDto authenticatedUser) {</w:t>
-        <w:br/>
-        <w:t xml:space="preserve">    Long clientId = AuthenticatedUserContext</w:t>
-        <w:br/>
-        <w:t xml:space="preserve">            .require(authenticatedUser)</w:t>
-        <w:br/>
-        <w:t xml:space="preserve">            .userId();</w:t>
-        <w:br/>
-        <w:t xml:space="preserve">    return bookingServiceClient.bookWorkout(clientId, workoutId);</w:t>
+        <w:t xml:space="preserve">query {</w:t>
+        <w:br/>
+        <w:t xml:space="preserve">  myProgress {</w:t>
+        <w:br/>
+        <w:t xml:space="preserve">    idProgress</w:t>
+        <w:br/>
+        <w:t xml:space="preserve">    completionPercentage</w:t>
+        <w:br/>
+        <w:t xml:space="preserve">    date</w:t>
+        <w:br/>
+        <w:t xml:space="preserve">  }</w:t>
         <w:br/>
         <w:t xml:space="preserve">}</w:t>
       </w:r>
@@ -16815,7 +16805,7 @@
       </w:pPr>
       <w:r>
         <w:rPr/>
-        <w:t xml:space="preserve">Тот же подход используется для myBookings, mySubscriptions, myPayments, myProgress, cancelBooking и createSubscription. Роль из SessionUserDto передаётся в GraphQlAuthorizationPolicy, который разрешает или запрещает Query и Mutation до вызова обработчика.</w:t>
+        <w:t xml:space="preserve">Запрос выполняется с действительным JWT и активной Redis-сессией. Аргумент userId отсутствует: API Gateway получает его из SessionUserDto и передаёт в сервисный слой. Ожидаемый результат — HTTP 200 OK и данные прогресса текущего пользователя.</w:t>
       </w:r>
     </w:p>
     <w:p>
@@ -16826,27 +16816,7 @@
         <w:rPr>
           <w:b/>
         </w:rPr>
-        <w:t xml:space="preserve">4.4. Тестирование защиты GraphQL API</w:t>
-      </w:r>
-    </w:p>
-    <w:p>
-      <w:pPr>
-        <w:jc w:val="both"/>
-      </w:pPr>
-      <w:r>
-        <w:rPr/>
-        <w:t xml:space="preserve">Для защищённых запросов в Altair указывается заголовок Authorization: Bearer &lt;токен_из_login&gt;. Ниже приведены текстовые запросы; изображения запросов и ответов не используются.</w:t>
-      </w:r>
-    </w:p>
-    <w:p>
-      <w:pPr>
-        <w:jc w:val="both"/>
-      </w:pPr>
-      <w:r>
-        <w:rPr>
-          <w:b/>
-        </w:rPr>
-        <w:t xml:space="preserve">Листинг 35 – запрос без JWT</w:t>
+        <w:t xml:space="preserve">Листинг 35 – запись текущего пользователя на занятие</w:t>
       </w:r>
     </w:p>
     <w:p>
@@ -16859,13 +16829,17 @@
           <w:rFonts w:ascii="Courier New" w:hAnsi="Courier New" w:eastAsia="Courier New"/>
           <w:sz w:val="18"/>
         </w:rPr>
-        <w:t xml:space="preserve">query {</w:t>
-        <w:br/>
-        <w:t xml:space="preserve">  trainingPrograms {</w:t>
-        <w:br/>
-        <w:t xml:space="preserve">    idTrainingProgram</w:t>
-        <w:br/>
-        <w:t xml:space="preserve">    name</w:t>
+        <w:t xml:space="preserve">mutation {</w:t>
+        <w:br/>
+        <w:t xml:space="preserve">  bookWorkout(input: {</w:t>
+        <w:br/>
+        <w:t xml:space="preserve">    idWorkout: 1</w:t>
+        <w:br/>
+        <w:t xml:space="preserve">  }) {</w:t>
+        <w:br/>
+        <w:t xml:space="preserve">    idBooking</w:t>
+        <w:br/>
+        <w:t xml:space="preserve">    status</w:t>
         <w:br/>
         <w:t xml:space="preserve">  }</w:t>
         <w:br/>
@@ -16878,7 +16852,7 @@
       </w:pPr>
       <w:r>
         <w:rPr/>
-        <w:t xml:space="preserve">Запрос выполняется без заголовка Authorization. Ожидается HTTP 401, так как защищённая операция не получает JWT.</w:t>
+        <w:t xml:space="preserve">Запрос выполняется с JWT клиента. В аргументах передаётся только idWorkout; идентификатор клиента определяется по проверенной сессии. Ожидаемый результат — HTTP 200 OK и создание записи от имени текущего пользователя. Подменить клиента передачей другого userId невозможно.</w:t>
       </w:r>
     </w:p>
     <w:p>
@@ -16889,32 +16863,7 @@
         <w:rPr>
           <w:b/>
         </w:rPr>
-        <w:t xml:space="preserve">Листинг 36 – запрос с действительным JWT и сессией</w:t>
-      </w:r>
-    </w:p>
-    <w:p>
-      <w:pPr>
-        <w:jc w:val="both"/>
-        <w:shd w:fill="F2F2F2"/>
-      </w:pPr>
-      <w:r>
-        <w:rPr>
-          <w:rFonts w:ascii="Courier New" w:hAnsi="Courier New" w:eastAsia="Courier New"/>
-          <w:sz w:val="18"/>
-        </w:rPr>
-        <w:t xml:space="preserve">query {</w:t>
-        <w:br/>
-        <w:t xml:space="preserve">  trainingPrograms {</w:t>
-        <w:br/>
-        <w:t xml:space="preserve">    idTrainingProgram</w:t>
-        <w:br/>
-        <w:t xml:space="preserve">    name</w:t>
-        <w:br/>
-        <w:t xml:space="preserve">    difficultyLevel</w:t>
-        <w:br/>
-        <w:t xml:space="preserve">  }</w:t>
-        <w:br/>
-        <w:t xml:space="preserve">}</w:t>
+        <w:t xml:space="preserve">Вывод по пункту 4</w:t>
       </w:r>
     </w:p>
     <w:p>
@@ -16923,7 +16872,7 @@
       </w:pPr>
       <w:r>
         <w:rPr/>
-        <w:t xml:space="preserve">С заголовком Authorization: Bearer &lt;токен&gt; запрос выполняется. Это подтверждает одновременную проверку JWT и Redis-сессии.</w:t>
+        <w:t xml:space="preserve">GraphQL API защищён до вызова резолверов: для защищённых операций проверяются JWT и активная Redis-сессия. При отсутствии действующей аутентификации возвращается HTTP 401. Информация о проверенном пользователе и его роли передаётся через GraphQLContext в сервисный слой, а доступ к операциям дополнительно ограничивается ролью согласно пункту 3.</w:t>
       </w:r>
     </w:p>
     <w:p>
@@ -16934,34 +16883,7 @@
         <w:rPr>
           <w:b/>
         </w:rPr>
-        <w:t xml:space="preserve">Листинг 37 – личный запрос с идентификатором из контекста</w:t>
-      </w:r>
-    </w:p>
-    <w:p>
-      <w:pPr>
-        <w:jc w:val="both"/>
-        <w:shd w:fill="F2F2F2"/>
-      </w:pPr>
-      <w:r>
-        <w:rPr>
-          <w:rFonts w:ascii="Courier New" w:hAnsi="Courier New" w:eastAsia="Courier New"/>
-          <w:sz w:val="18"/>
-        </w:rPr>
-        <w:t xml:space="preserve">query {</w:t>
-        <w:br/>
-        <w:t xml:space="preserve">  myProgress {</w:t>
-        <w:br/>
-        <w:t xml:space="preserve">    idProgress</w:t>
-        <w:br/>
-        <w:t xml:space="preserve">    date</w:t>
-        <w:br/>
-        <w:t xml:space="preserve">    value</w:t>
-        <w:br/>
-        <w:t xml:space="preserve">    trainerComment</w:t>
-        <w:br/>
-        <w:t xml:space="preserve">  }</w:t>
-        <w:br/>
-        <w:t xml:space="preserve">}</w:t>
+        <w:t xml:space="preserve">Общий вывод по лабораторной работе № 5</w:t>
       </w:r>
     </w:p>
     <w:p>
@@ -16970,90 +16892,7 @@
       </w:pPr>
       <w:r>
         <w:rPr/>
-        <w:t xml:space="preserve">Для запроса не передаётся clientId. API Gateway получает идентификатор пользователя из SessionUserDto и передаёт его в сервисный слой. Это исключает подмену идентификатора другого клиента в аргументах GraphQL.</w:t>
-      </w:r>
-    </w:p>
-    <w:p>
-      <w:pPr>
-        <w:jc w:val="both"/>
-      </w:pPr>
-      <w:r>
-        <w:rPr>
-          <w:b/>
-        </w:rPr>
-        <w:t xml:space="preserve">Листинг 38 – запрос после удаления Redis-сессии</w:t>
-      </w:r>
-    </w:p>
-    <w:p>
-      <w:pPr>
-        <w:jc w:val="both"/>
-        <w:shd w:fill="F2F2F2"/>
-      </w:pPr>
-      <w:r>
-        <w:rPr>
-          <w:rFonts w:ascii="Courier New" w:hAnsi="Courier New" w:eastAsia="Courier New"/>
-          <w:sz w:val="18"/>
-        </w:rPr>
-        <w:t xml:space="preserve">query {</w:t>
-        <w:br/>
-        <w:t xml:space="preserve">  trainingPrograms {</w:t>
-        <w:br/>
-        <w:t xml:space="preserve">    idTrainingProgram</w:t>
-        <w:br/>
-        <w:t xml:space="preserve">    name</w:t>
-        <w:br/>
-        <w:t xml:space="preserve">  }</w:t>
-        <w:br/>
-        <w:t xml:space="preserve">}</w:t>
-      </w:r>
-    </w:p>
-    <w:p>
-      <w:pPr>
-        <w:jc w:val="both"/>
-      </w:pPr>
-      <w:r>
-        <w:rPr/>
-        <w:t xml:space="preserve">Перед отправкой удалить ключ auth:session:{jti} командой redis-cli. С тем же JWT запрос возвращает HTTP 401 и требует выполнить login повторно. После нового login создаётся новая сессия, и защищённый запрос снова доступен.</w:t>
-      </w:r>
-    </w:p>
-    <w:p>
-      <w:pPr>
-        <w:jc w:val="both"/>
-      </w:pPr>
-      <w:r>
-        <w:rPr>
-          <w:b/>
-        </w:rPr>
-        <w:t xml:space="preserve">Вывод по пункту 4</w:t>
-      </w:r>
-    </w:p>
-    <w:p>
-      <w:pPr>
-        <w:jc w:val="both"/>
-      </w:pPr>
-      <w:r>
-        <w:rPr/>
-        <w:t xml:space="preserve">GraphQL API защищён проверкой JWT, наличия Redis-сессии и роли пользователя. Неаутентифицированный пользователь не получает доступ к защищённым операциям. Проверенный пользователь и его роль передаются через GraphQL-контекст в сервисный слой, а права на Query и Mutation проверяются до выполнения бизнес-операции.</w:t>
-      </w:r>
-    </w:p>
-    <w:p>
-      <w:pPr>
-        <w:jc w:val="both"/>
-      </w:pPr>
-      <w:r>
-        <w:rPr>
-          <w:b/>
-        </w:rPr>
-        <w:t xml:space="preserve">Общий вывод по лабораторной работе № 5</w:t>
-      </w:r>
-    </w:p>
-    <w:p>
-      <w:pPr>
-        <w:jc w:val="both"/>
-      </w:pPr>
-      <w:r>
-        <w:rPr/>
-        <w:t xml:space="preserve">Реализованы регистрация и вход пользователей, проверка учётных данных, JWT, хранение пользователей и ролей, активные Redis-сессии, ролевая авторизация и защита GraphQL API. Сквозная проверка подтвердила работу пунктов 1–4: корректный вход, отказ при неверном пароле, создание и истечение Redis-сессии, повторную аутентификацию, разграничение ролей client, trainer и admin, а также передачу проверенного пользователя в личные операции.</w:t>
+        <w:t xml:space="preserve">Реализованы регистрация и вход пользователей, проверка учётных данных, JWT, хранение пользователей и ролей, активные Redis-сессии, ролевая авторизация и защита GraphQL API. Реализация обеспечивает повторную аутентификацию после завершения сессии, запрещает несанкционированные обращения и передаёт в бизнес-логику только проверенные сведения о пользователе.</w:t>
       </w:r>
     </w:p>
     <w:sectPr>

</xml_diff>

<commit_message>
docs: align booking context listing with source
</commit_message>
<xml_diff>
--- a/docs/lab5-p1-p2.docx
+++ b/docs/lab5-p1-p2.docx
@@ -16670,7 +16670,7 @@
         <w:br/>
         <w:t xml:space="preserve">public BookingDto bookWorkout(</w:t>
         <w:br/>
-        <w:t xml:space="preserve">        @Argument BookWorkoutInputDto input,</w:t>
+        <w:t xml:space="preserve">        @Argument Long workoutId,</w:t>
         <w:br/>
         <w:t xml:space="preserve">        @ContextValue(GraphQlAuthenticationInterceptor</w:t>
         <w:br/>
@@ -16686,7 +16686,7 @@
         <w:br/>
         <w:t xml:space="preserve">    return bookingServiceClient.bookWorkout(</w:t>
         <w:br/>
-        <w:t xml:space="preserve">            clientId, input.idWorkout());</w:t>
+        <w:t xml:space="preserve">            clientId, workoutId);</w:t>
         <w:br/>
         <w:t xml:space="preserve">}</w:t>
       </w:r>

</xml_diff>

<commit_message>
docs: correct protected booking mutation syntax
</commit_message>
<xml_diff>
--- a/docs/lab5-p1-p2.docx
+++ b/docs/lab5-p1-p2.docx
@@ -16831,11 +16831,7 @@
         </w:rPr>
         <w:t xml:space="preserve">mutation {</w:t>
         <w:br/>
-        <w:t xml:space="preserve">  bookWorkout(input: {</w:t>
-        <w:br/>
-        <w:t xml:space="preserve">    idWorkout: 1</w:t>
-        <w:br/>
-        <w:t xml:space="preserve">  }) {</w:t>
+        <w:t xml:space="preserve">  bookWorkout(workoutId: 1) {</w:t>
         <w:br/>
         <w:t xml:space="preserve">    idBooking</w:t>
         <w:br/>

</xml_diff>